<commit_message>
feat: M&M betnhos BEQI-FR publi + SI
</commit_message>
<xml_diff>
--- a/inst/report/Draft_Etat_conditions_nourriceries_estuariennes.docx
+++ b/inst/report/Draft_Etat_conditions_nourriceries_estuariennes.docx
@@ -4,74 +4,6 @@
   <w:body>
     <w:p>
       <w:pPr>
-        <w:pStyle w:val="Titre1"/>
-        <w:rPr>
-          <w:lang w:val="en-US"/>
-        </w:rPr>
-      </w:pPr>
-      <w:r>
-        <w:rPr>
-          <w:lang w:val="en-US"/>
-        </w:rPr>
-        <w:t xml:space="preserve">Historical Trends and </w:t>
-      </w:r>
-      <w:r>
-        <w:rPr>
-          <w:lang w:val="en-US"/>
-        </w:rPr>
-        <w:t>Emerg</w:t>
-      </w:r>
-      <w:r>
-        <w:rPr>
-          <w:lang w:val="en-US"/>
-        </w:rPr>
-        <w:t>ing</w:t>
-      </w:r>
-      <w:r>
-        <w:rPr>
-          <w:lang w:val="en-US"/>
-        </w:rPr>
-        <w:t xml:space="preserve"> </w:t>
-      </w:r>
-      <w:r>
-        <w:rPr>
-          <w:lang w:val="en-US"/>
-        </w:rPr>
-        <w:t xml:space="preserve">Environmental Pressures </w:t>
-      </w:r>
-      <w:r>
-        <w:rPr>
-          <w:lang w:val="en-US"/>
-        </w:rPr>
-        <w:t>on</w:t>
-      </w:r>
-      <w:r>
-        <w:rPr>
-          <w:lang w:val="en-US"/>
-        </w:rPr>
-        <w:t xml:space="preserve"> Nursery Function in French Estuaries: An Integrated Approach Combining Contaminants, Water Quality, Benthic </w:t>
-      </w:r>
-      <w:r>
-        <w:rPr>
-          <w:lang w:val="en-US"/>
-        </w:rPr>
-        <w:t xml:space="preserve">Fauna </w:t>
-      </w:r>
-      <w:r>
-        <w:rPr>
-          <w:lang w:val="en-US"/>
-        </w:rPr>
-        <w:t>and Fish Communities</w:t>
-      </w:r>
-      <w:r>
-        <w:rPr>
-          <w:lang w:val="en-US"/>
-        </w:rPr>
-        <w:br w:type="page"/>
-      </w:r>
-    </w:p>
-    <w:p>
-      <w:pPr>
         <w:pStyle w:val="Titre2"/>
         <w:rPr>
           <w:lang w:val="en-US"/>
@@ -81,7 +13,6 @@
         <w:rPr>
           <w:lang w:val="en-US"/>
         </w:rPr>
-        <w:lastRenderedPageBreak/>
         <w:t>Material and methods</w:t>
       </w:r>
     </w:p>
@@ -8347,643 +8278,16 @@
       <w:pPr>
         <w:pStyle w:val="Titre3"/>
         <w:rPr>
-          <w:lang w:val="en-US"/>
-        </w:rPr>
-      </w:pPr>
-      <w:r>
-        <w:rPr>
+          <w:highlight w:val="yellow"/>
+          <w:lang w:val="en-US"/>
+        </w:rPr>
+      </w:pPr>
+      <w:r>
+        <w:rPr>
+          <w:highlight w:val="yellow"/>
           <w:lang w:val="en-US"/>
         </w:rPr>
         <w:lastRenderedPageBreak/>
-        <w:t xml:space="preserve">Contamination of biota </w:t>
-      </w:r>
-      <w:r>
-        <w:rPr>
-          <w:lang w:val="en-US"/>
-        </w:rPr>
-        <w:t xml:space="preserve">and sea water </w:t>
-      </w:r>
-      <w:r>
-        <w:rPr>
-          <w:lang w:val="en-US"/>
-        </w:rPr>
-        <w:t xml:space="preserve">by </w:t>
-      </w:r>
-      <w:r>
-        <w:rPr>
-          <w:lang w:val="en-US"/>
-        </w:rPr>
-        <w:t>emerg</w:t>
-      </w:r>
-      <w:r>
-        <w:rPr>
-          <w:lang w:val="en-US"/>
-        </w:rPr>
-        <w:t>ing</w:t>
-      </w:r>
-      <w:r>
-        <w:rPr>
-          <w:lang w:val="en-US"/>
-        </w:rPr>
-        <w:t xml:space="preserve"> </w:t>
-      </w:r>
-      <w:r>
-        <w:rPr>
-          <w:lang w:val="en-US"/>
-        </w:rPr>
-        <w:t>biocides</w:t>
-      </w:r>
-    </w:p>
-    <w:p>
-      <w:pPr>
-        <w:rPr>
-          <w:lang w:val="en-US"/>
-        </w:rPr>
-      </w:pPr>
-      <w:r>
-        <w:rPr>
-          <w:lang w:val="en-US"/>
-        </w:rPr>
-        <w:t xml:space="preserve">As part of the revision of the national list of Specific Pollutants of Ecological Status (PSEE), aimed at identifying relevant substances for monitoring in coastal environments, </w:t>
-      </w:r>
-      <w:proofErr w:type="spellStart"/>
-      <w:r>
-        <w:rPr>
-          <w:lang w:val="en-US"/>
-        </w:rPr>
-        <w:t>Ifremer</w:t>
-      </w:r>
-      <w:proofErr w:type="spellEnd"/>
-      <w:r>
-        <w:rPr>
-          <w:lang w:val="en-US"/>
-        </w:rPr>
-        <w:t xml:space="preserve"> investigated 102 emerging organic substances (i.e., not currently regulated for the marine environment), including </w:t>
-      </w:r>
-      <w:r>
-        <w:rPr>
-          <w:lang w:val="en-US"/>
-        </w:rPr>
-        <w:t>different types of</w:t>
-      </w:r>
-      <w:r>
-        <w:rPr>
-          <w:lang w:val="en-US"/>
-        </w:rPr>
-        <w:t xml:space="preserve"> biocides</w:t>
-      </w:r>
-      <w:r>
-        <w:rPr>
-          <w:lang w:val="en-US"/>
-        </w:rPr>
-        <w:t xml:space="preserve"> </w:t>
-      </w:r>
-      <w:r>
-        <w:rPr>
-          <w:lang w:val="en-US"/>
-        </w:rPr>
-        <w:fldChar w:fldCharType="begin"/>
-      </w:r>
-      <w:r>
-        <w:rPr>
-          <w:lang w:val="en-US"/>
-        </w:rPr>
-        <w:instrText xml:space="preserve"> ADDIN ZOTERO_ITEM CSL_CITATION {"citationID":"APQfKCTY","properties":{"formattedCitation":"(Amouroux {\\i{}et al.}, 2025)","plainCitation":"(Amouroux et al., 2025)","noteIndex":0},"citationItems":[{"id":1207,"uris":["http://zotero.org/users/3305729/items/V6X6YRI4"],"itemData":{"id":1207,"type":"article-journal","abstract":"le projet emergent’sea a été conduit en france métropolitaine sur la période 2021‐2024, par ifremer, epoc et ofb. ce projet a permis l’acquisition de données de concentration sur des substances d’intérêt émergent (pesticides, pharmaceutiques, biocides, biocides antisalissures, plastifiants, composés métalliques) sur des points de suivi considérés comme exposés à des apports de contaminants issus des bassins versants, sur des matrices intégratrices : mollusques (34 points de suivi) et échantillonneurs passifs (pocis, dgt) (26 points de suivi). ce projet a ainsi permis une acquisition, sur l’ensemble du littoral français, de données aussi homogènes que possible : période d’acquisition, échantillonnage, analyses, traitement des données. l’objectif final était de pouvoir identifier les substances pertinentes pouvant être proposées in fine en tant que substances candidates psee (polluants spécifiques de l’etat ecologique) pour les eaux littorales dans le cadre de la dce. la priorisation des substances est réalisée en considérant l’occurrence des contaminations et une approche risque, elle s’appuie sur la méthodologie de priorisation du cep (comité expert priorisation), et utilise des pnec (concentration prédite sans effet) déterminées par ineris, ou issues du réseau norman. la priorisation concerne uniquement les substances organiques. parmi les 102 substances organiques recherchées, 77% des substances « quantifiables » sont quantifiées en eau marine (51 / 66 substances) et 65 % dans les mollusques (34/52 substances). ce projet permet ainsi de proposer une liste de substances priorisées sur eau marine et une liste de substances priorisées sur mollusques, substances pouvant être considérées comme pertinentes pour un suivi en eau littorale. cette démarche permet de démontrer à l’échelle nationale la complémentarité des suivis en eau marine via échantillonneurs passifs et dans les mollusques, elle met également en évidence un manque de pnec eau marine, pnec mollusques[...]","container-title":"Ref. Ifremer/RBE/CCEM‐ARC‐15.12.2024","language":"fr","page":"61","source":"archimer.ifremer.fr","title":"Emergent’Sea. Recherche des substances d’intérêt émergent en milieu marin","volume":"Contrat R&amp;D OFB 21‐453","author":[{"family":"Amouroux","given":"Isabelle"},{"family":"Gonzalez","given":"Jean-Louis"},{"family":"Grouhel","given":"Anne"},{"family":"Chavanon","given":"Fabienne"},{"family":"Augagneur","given":"Sylvie"},{"family":"Bruneau","given":"Audrey"},{"family":"Budzinski","given":"Hélène"},{"family":"Dagault","given":"Francoise"},{"family":"Duquesne","given":"Vincent"},{"family":"Gabellec","given":"Raoul"},{"family":"Le Bon","given":"Fabien"},{"family":"Lebrun","given":"Luc"},{"family":"Le Fur","given":"Ines"},{"family":"Le Gall","given":"Patrik"},{"family":"Gianaroli","given":"Camille"},{"family":"Lissardy","given":"Muriel"},{"family":"Maheux","given":"Frank"},{"family":"Munaron","given":"Dominique"},{"family":"Pierre Duplessix","given":"Olivier"},{"family":"Ravel","given":"Christophe"},{"family":"Retho","given":"Michael"},{"family":"Schmidt","given":"Anne"},{"family":"Simon","given":"Benjamin"},{"family":"Sireau","given":"Teddy"},{"family":"Staub","given":"Pierre-François"},{"family":"Tapie","given":"Nathalie"},{"family":"Thevand","given":"Adeline"}],"issued":{"date-parts":[["2025",4,17]]},"citation-key":"amourouxEmergentSeaRechercheSubstances2025"}}],"schema":"https://github.com/citation-style-language/schema/raw/master/csl-citation.json"} </w:instrText>
-      </w:r>
-      <w:r>
-        <w:rPr>
-          <w:lang w:val="en-US"/>
-        </w:rPr>
-        <w:fldChar w:fldCharType="separate"/>
-      </w:r>
-      <w:r>
-        <w:rPr>
-          <w:rFonts w:ascii="Calibri Light" w:hAnsi="Calibri Light" w:cs="Calibri Light"/>
-          <w:szCs w:val="24"/>
-          <w:lang w:val="en-US"/>
-        </w:rPr>
-        <w:t xml:space="preserve">(Amouroux </w:t>
-      </w:r>
-      <w:r>
-        <w:rPr>
-          <w:rFonts w:ascii="Calibri Light" w:hAnsi="Calibri Light" w:cs="Calibri Light"/>
-          <w:i/>
-          <w:iCs/>
-          <w:szCs w:val="24"/>
-          <w:lang w:val="en-US"/>
-        </w:rPr>
-        <w:t>et al.</w:t>
-      </w:r>
-      <w:r>
-        <w:rPr>
-          <w:rFonts w:ascii="Calibri Light" w:hAnsi="Calibri Light" w:cs="Calibri Light"/>
-          <w:szCs w:val="24"/>
-          <w:lang w:val="en-US"/>
-        </w:rPr>
-        <w:t>, 2025)</w:t>
-      </w:r>
-      <w:r>
-        <w:rPr>
-          <w:lang w:val="en-US"/>
-        </w:rPr>
-        <w:fldChar w:fldCharType="end"/>
-      </w:r>
-      <w:r>
-        <w:rPr>
-          <w:lang w:val="en-US"/>
-        </w:rPr>
-        <w:t>. These measurements were carried out in 2021 and 2022, alongside ROCCHMV sampling, using integrative matrices—namely, bivalves and passive samplers (POCIS)—to facilitate the detection of these substances.</w:t>
-      </w:r>
-      <w:r>
-        <w:rPr>
-          <w:lang w:val="en-US"/>
-        </w:rPr>
-        <w:t xml:space="preserve"> </w:t>
-      </w:r>
-      <w:r>
-        <w:rPr>
-          <w:lang w:val="en-US"/>
-        </w:rPr>
-        <w:t xml:space="preserve">The use of passive samplers is particularly suited for targeting organic compounds with low hydrophobicity, which are expected to exhibit limited bioconcentration and bioaccumulation in marine organisms. </w:t>
-      </w:r>
-      <w:r>
-        <w:rPr>
-          <w:lang w:val="en-US"/>
-        </w:rPr>
-        <w:t>In addition, the compounds studied are generally less persistent than those subject to regulation, making them more susceptible to seasonal variation.</w:t>
-      </w:r>
-    </w:p>
-    <w:p>
-      <w:pPr>
-        <w:rPr>
-          <w:lang w:val="en-US"/>
-        </w:rPr>
-      </w:pPr>
-      <w:r>
-        <w:rPr>
-          <w:lang w:val="en-US"/>
-        </w:rPr>
-        <w:t xml:space="preserve">Sampling sites and periods were selected to coincide with locations and times of known contaminant inputs (i.e., related to usage patterns). The emerging compounds selected for this study </w:t>
-      </w:r>
-      <w:r>
-        <w:rPr>
-          <w:lang w:val="en-US"/>
-        </w:rPr>
-        <w:t xml:space="preserve">(see </w:t>
-      </w:r>
-      <w:r>
-        <w:rPr>
-          <w:lang w:val="en-US"/>
-        </w:rPr>
-        <w:fldChar w:fldCharType="begin"/>
-      </w:r>
-      <w:r>
-        <w:rPr>
-          <w:lang w:val="en-US"/>
-        </w:rPr>
-        <w:instrText xml:space="preserve"> REF _Ref204761649 \h </w:instrText>
-      </w:r>
-      <w:r>
-        <w:rPr>
-          <w:lang w:val="en-US"/>
-        </w:rPr>
-      </w:r>
-      <w:r>
-        <w:rPr>
-          <w:lang w:val="en-US"/>
-        </w:rPr>
-        <w:fldChar w:fldCharType="separate"/>
-      </w:r>
-      <w:r>
-        <w:rPr>
-          <w:lang w:val="en-US"/>
-        </w:rPr>
-        <w:t xml:space="preserve">Table </w:t>
-      </w:r>
-      <w:r>
-        <w:rPr>
-          <w:noProof/>
-          <w:lang w:val="en-US"/>
-        </w:rPr>
-        <w:t>5</w:t>
-      </w:r>
-      <w:r>
-        <w:rPr>
-          <w:lang w:val="en-US"/>
-        </w:rPr>
-        <w:fldChar w:fldCharType="end"/>
-      </w:r>
-      <w:r>
-        <w:rPr>
-          <w:lang w:val="en-US"/>
-        </w:rPr>
-        <w:t xml:space="preserve">) </w:t>
-      </w:r>
-      <w:r>
-        <w:rPr>
-          <w:lang w:val="en-US"/>
-        </w:rPr>
-        <w:t xml:space="preserve">include those quantified </w:t>
-      </w:r>
-      <w:r>
-        <w:rPr>
-          <w:lang w:val="en-US"/>
-        </w:rPr>
-        <w:t xml:space="preserve">in at least </w:t>
-      </w:r>
-      <w:r>
-        <w:rPr>
-          <w:lang w:val="en-US"/>
-        </w:rPr>
-        <w:t>one</w:t>
-      </w:r>
-      <w:r>
-        <w:rPr>
-          <w:lang w:val="en-US"/>
-        </w:rPr>
-        <w:t xml:space="preserve"> </w:t>
-      </w:r>
-      <w:r>
-        <w:rPr>
-          <w:lang w:val="en-US"/>
-        </w:rPr>
-        <w:t xml:space="preserve">of the three </w:t>
-      </w:r>
-      <w:r>
-        <w:rPr>
-          <w:lang w:val="en-US"/>
-        </w:rPr>
-        <w:t>estuary</w:t>
-      </w:r>
-      <w:r>
-        <w:rPr>
-          <w:lang w:val="en-US"/>
-        </w:rPr>
-        <w:t xml:space="preserve"> </w:t>
-      </w:r>
-      <w:r>
-        <w:rPr>
-          <w:lang w:val="en-US"/>
-        </w:rPr>
-        <w:t xml:space="preserve">(Seine: </w:t>
-      </w:r>
-      <w:proofErr w:type="spellStart"/>
-      <w:r>
-        <w:rPr>
-          <w:lang w:val="en-US"/>
-        </w:rPr>
-        <w:t>Villerville</w:t>
-      </w:r>
-      <w:proofErr w:type="spellEnd"/>
-      <w:r>
-        <w:rPr>
-          <w:lang w:val="en-US"/>
-        </w:rPr>
-        <w:t xml:space="preserve"> site; Loire: </w:t>
-      </w:r>
-      <w:proofErr w:type="spellStart"/>
-      <w:r>
-        <w:rPr>
-          <w:lang w:val="en-US"/>
-        </w:rPr>
-        <w:t>Montoir</w:t>
-      </w:r>
-      <w:proofErr w:type="spellEnd"/>
-      <w:r>
-        <w:rPr>
-          <w:lang w:val="en-US"/>
-        </w:rPr>
-        <w:t xml:space="preserve">-Ponton site; Gironde: </w:t>
-      </w:r>
-      <w:proofErr w:type="spellStart"/>
-      <w:r>
-        <w:rPr>
-          <w:lang w:val="en-US"/>
-        </w:rPr>
-        <w:t>Pontaillac</w:t>
-      </w:r>
-      <w:proofErr w:type="spellEnd"/>
-      <w:r>
-        <w:rPr>
-          <w:lang w:val="en-US"/>
-        </w:rPr>
-        <w:t xml:space="preserve"> site)</w:t>
-      </w:r>
-      <w:r>
-        <w:rPr>
-          <w:lang w:val="en-US"/>
-        </w:rPr>
-        <w:t xml:space="preserve"> and quantified </w:t>
-      </w:r>
-      <w:r>
-        <w:rPr>
-          <w:lang w:val="en-US"/>
-        </w:rPr>
-        <w:t>in seawater (</w:t>
-      </w:r>
-      <w:r>
-        <w:rPr>
-          <w:lang w:val="en-US"/>
-        </w:rPr>
-        <w:t>2</w:t>
-      </w:r>
-      <w:r>
-        <w:rPr>
-          <w:lang w:val="en-US"/>
-        </w:rPr>
-        <w:t xml:space="preserve"> </w:t>
-      </w:r>
-      <w:r>
-        <w:rPr>
-          <w:lang w:val="en-US"/>
-        </w:rPr>
-        <w:t xml:space="preserve">herbicides) </w:t>
-      </w:r>
-      <w:r>
-        <w:rPr>
-          <w:lang w:val="en-US"/>
-        </w:rPr>
-        <w:t>or</w:t>
-      </w:r>
-      <w:r>
-        <w:rPr>
-          <w:lang w:val="en-US"/>
-        </w:rPr>
-        <w:t xml:space="preserve"> in bivalves (</w:t>
-      </w:r>
-      <w:r>
-        <w:rPr>
-          <w:lang w:val="en-US"/>
-        </w:rPr>
-        <w:t xml:space="preserve">7 </w:t>
-      </w:r>
-      <w:r>
-        <w:rPr>
-          <w:lang w:val="en-US"/>
-        </w:rPr>
-        <w:t>antifouling agents,</w:t>
-      </w:r>
-      <w:r>
-        <w:rPr>
-          <w:lang w:val="en-US"/>
-        </w:rPr>
-        <w:t xml:space="preserve"> </w:t>
-      </w:r>
-      <w:r>
-        <w:rPr>
-          <w:lang w:val="en-US"/>
-        </w:rPr>
-        <w:t xml:space="preserve">7 </w:t>
-      </w:r>
-      <w:r>
-        <w:rPr>
-          <w:lang w:val="en-US"/>
-        </w:rPr>
-        <w:t xml:space="preserve">fungicides, 1 insecticide and </w:t>
-      </w:r>
-      <w:r>
-        <w:rPr>
-          <w:lang w:val="en-US"/>
-        </w:rPr>
-        <w:t xml:space="preserve">14 </w:t>
-      </w:r>
-      <w:r>
-        <w:rPr>
-          <w:lang w:val="en-US"/>
-        </w:rPr>
-        <w:t>herbicid</w:t>
-      </w:r>
-      <w:r>
-        <w:rPr>
-          <w:lang w:val="en-US"/>
-        </w:rPr>
-        <w:t>e</w:t>
-      </w:r>
-      <w:r>
-        <w:rPr>
-          <w:lang w:val="en-US"/>
-        </w:rPr>
-        <w:t>s)</w:t>
-      </w:r>
-      <w:r>
-        <w:rPr>
-          <w:lang w:val="en-US"/>
-        </w:rPr>
-        <w:t xml:space="preserve">. </w:t>
-      </w:r>
-    </w:p>
-    <w:p>
-      <w:pPr>
-        <w:rPr>
-          <w:lang w:val="en-US"/>
-        </w:rPr>
-      </w:pPr>
-      <w:r>
-        <w:rPr>
-          <w:lang w:val="en-US"/>
-        </w:rPr>
-        <w:t xml:space="preserve">To </w:t>
-      </w:r>
-      <w:r>
-        <w:rPr>
-          <w:lang w:val="en-US"/>
-        </w:rPr>
-        <w:t>determine w</w:t>
-      </w:r>
-      <w:r>
-        <w:rPr>
-          <w:lang w:val="en-US"/>
-        </w:rPr>
-        <w:t>h</w:t>
-      </w:r>
-      <w:r>
-        <w:rPr>
-          <w:lang w:val="en-US"/>
-        </w:rPr>
-        <w:t xml:space="preserve">ether the </w:t>
-      </w:r>
-      <w:r>
-        <w:rPr>
-          <w:lang w:val="en-US"/>
-        </w:rPr>
-        <w:t xml:space="preserve">estuaries were more contaminated than </w:t>
-      </w:r>
-      <w:r>
-        <w:rPr>
-          <w:lang w:val="en-US"/>
-        </w:rPr>
-        <w:t xml:space="preserve">the </w:t>
-      </w:r>
-      <w:r>
-        <w:rPr>
-          <w:lang w:val="en-US"/>
-        </w:rPr>
-        <w:t>French coast</w:t>
-      </w:r>
-      <w:r>
-        <w:rPr>
-          <w:lang w:val="en-US"/>
-        </w:rPr>
-        <w:t>line overall,</w:t>
-      </w:r>
-      <w:r>
-        <w:rPr>
-          <w:lang w:val="en-US"/>
-        </w:rPr>
-        <w:t xml:space="preserve"> a</w:t>
-      </w:r>
-      <w:r>
-        <w:rPr>
-          <w:lang w:val="en-US"/>
-        </w:rPr>
-        <w:t xml:space="preserve">nnual mean concentrations were calculated at the national level </w:t>
-      </w:r>
-      <w:r>
-        <w:rPr>
-          <w:lang w:val="en-US"/>
-        </w:rPr>
-        <w:t>and compared with</w:t>
-      </w:r>
-      <w:r>
-        <w:rPr>
-          <w:lang w:val="en-US"/>
-        </w:rPr>
-        <w:t xml:space="preserve"> </w:t>
-      </w:r>
-      <w:r>
-        <w:rPr>
-          <w:lang w:val="en-US"/>
-        </w:rPr>
-        <w:t xml:space="preserve">the corresponding </w:t>
-      </w:r>
-      <w:r>
-        <w:rPr>
-          <w:lang w:val="en-US"/>
-        </w:rPr>
-        <w:t>yearly mean</w:t>
-      </w:r>
-      <w:r>
-        <w:rPr>
-          <w:lang w:val="en-US"/>
-        </w:rPr>
-        <w:t>s</w:t>
-      </w:r>
-      <w:r>
-        <w:rPr>
-          <w:lang w:val="en-US"/>
-        </w:rPr>
-        <w:t xml:space="preserve"> </w:t>
-      </w:r>
-      <w:r>
-        <w:rPr>
-          <w:lang w:val="en-US"/>
-        </w:rPr>
-        <w:t xml:space="preserve">observed </w:t>
-      </w:r>
-      <w:r>
-        <w:rPr>
-          <w:lang w:val="en-US"/>
-        </w:rPr>
-        <w:t>in</w:t>
-      </w:r>
-      <w:r>
-        <w:rPr>
-          <w:lang w:val="en-US"/>
-        </w:rPr>
-        <w:t xml:space="preserve"> each estuary.</w:t>
-      </w:r>
-      <w:r>
-        <w:rPr>
-          <w:lang w:val="en-US"/>
-        </w:rPr>
-        <w:t xml:space="preserve"> </w:t>
-      </w:r>
-      <w:r>
-        <w:rPr>
-          <w:lang w:val="en-US"/>
-        </w:rPr>
-        <w:t xml:space="preserve">To </w:t>
-      </w:r>
-      <w:r>
-        <w:rPr>
-          <w:lang w:val="en-US"/>
-        </w:rPr>
-        <w:t>assess the potential environmental risk associated with these contamination levels, o</w:t>
-      </w:r>
-      <w:r>
-        <w:rPr>
-          <w:lang w:val="en-US"/>
-        </w:rPr>
-        <w:t xml:space="preserve">bserved </w:t>
-      </w:r>
-      <w:r>
-        <w:rPr>
-          <w:lang w:val="en-US"/>
-        </w:rPr>
-        <w:t>concentrations</w:t>
-      </w:r>
-      <w:r>
-        <w:rPr>
-          <w:lang w:val="en-US"/>
-        </w:rPr>
-        <w:t xml:space="preserve"> were also compared to </w:t>
-      </w:r>
-      <w:r>
-        <w:rPr>
-          <w:lang w:val="en-US"/>
-        </w:rPr>
-        <w:t>Predicted No Effect Concentration</w:t>
-      </w:r>
-      <w:r>
-        <w:rPr>
-          <w:lang w:val="en-US"/>
-        </w:rPr>
-        <w:t xml:space="preserve"> (PNEC</w:t>
-      </w:r>
-      <w:r>
-        <w:rPr>
-          <w:lang w:val="en-US"/>
-        </w:rPr>
-        <w:t>)</w:t>
-      </w:r>
-      <w:r>
-        <w:rPr>
-          <w:lang w:val="en-US"/>
-        </w:rPr>
-        <w:t xml:space="preserve"> values</w:t>
-      </w:r>
-      <w:r>
-        <w:rPr>
-          <w:lang w:val="en-US"/>
-        </w:rPr>
-        <w:t>.</w:t>
-      </w:r>
-      <w:r>
-        <w:rPr>
-          <w:lang w:val="en-US"/>
-        </w:rPr>
-        <w:t xml:space="preserve"> </w:t>
-      </w:r>
-      <w:r>
-        <w:rPr>
-          <w:lang w:val="en-US"/>
-        </w:rPr>
-        <w:t>Another way to evaluate whether contamination levels exceeding the national average may reflect an environmental risk was to consider the ranking of the compounds in the Emergent’Sea program. This ranking is based on the frequency of quantification of each compound, as well as the extent and frequency of PNEC exceedances.</w:t>
-      </w:r>
-    </w:p>
-    <w:p>
-      <w:pPr>
-        <w:pStyle w:val="Titre3"/>
-        <w:rPr>
-          <w:highlight w:val="yellow"/>
-          <w:lang w:val="en-US"/>
-        </w:rPr>
-      </w:pPr>
-      <w:r>
-        <w:rPr>
-          <w:highlight w:val="yellow"/>
-          <w:lang w:val="en-US"/>
-        </w:rPr>
         <w:t>Benthic invertebrate fauna</w:t>
       </w:r>
     </w:p>
@@ -9098,3957 +8402,18 @@
     </w:p>
     <w:p>
       <w:pPr>
-        <w:pStyle w:val="Titre4"/>
-        <w:rPr>
-          <w:lang w:val="en-US"/>
-        </w:rPr>
-      </w:pPr>
-      <w:r>
-        <w:rPr>
-          <w:lang w:val="en-US"/>
-        </w:rPr>
-        <w:t>Yearly ecological indices</w:t>
-      </w:r>
-    </w:p>
-    <w:p>
-      <w:pPr>
-        <w:rPr>
-          <w:lang w:val="en-US"/>
-        </w:rPr>
-      </w:pPr>
-      <w:r>
-        <w:rPr>
-          <w:lang w:val="en-US"/>
-        </w:rPr>
-        <w:t xml:space="preserve">French methodology DCE macro-invertebrates </w:t>
-      </w:r>
-      <w:r>
-        <w:rPr>
-          <w:lang w:val="en-US"/>
-        </w:rPr>
-        <w:fldChar w:fldCharType="begin"/>
-      </w:r>
-      <w:r>
-        <w:rPr>
-          <w:lang w:val="en-US"/>
-        </w:rPr>
-        <w:instrText xml:space="preserve"> ADDIN ZOTERO_ITEM CSL_CITATION {"citationID":"N7nC1Myo","properties":{"formattedCitation":"(Blanchet {\\i{}et al.}, 2025)","plainCitation":"(Blanchet et al., 2025)","noteIndex":0},"citationItems":[{"id":1204,"uris":["http://zotero.org/users/3305729/items/Q875VASZ"],"itemData":{"id":1204,"type":"report","collection-title":"Rapport Université de Bordeaux/UMR EPOC &amp; Ifremer.","language":"fr","source":"Zotero","title":"Méthodologie pour la surveillance et l’évaluation du paramètre « Macro-invertébrés benthiques » dans les masses d’eau de transition estuariennes de la façade Manche- Atlantique –","URL":"https://archimer.ifremer.fr/doc/00887/99923/118418.pdf","author":[{"family":"Blanchet","given":"Hugues"},{"family":"Fouet","given":"Marie"},{"family":"Bizzozero","given":"Lucie"},{"family":"Foveau","given":"Aurélie"}],"accessed":{"date-parts":[["2025",7,9]]},"issued":{"date-parts":[["2025",3]]},"citation-key":"blanchetMethodologiePourSurveillance2025"}}],"schema":"https://github.com/citation-style-language/schema/raw/master/csl-citation.json"} </w:instrText>
-      </w:r>
-      <w:r>
-        <w:rPr>
-          <w:lang w:val="en-US"/>
-        </w:rPr>
-        <w:fldChar w:fldCharType="separate"/>
-      </w:r>
-      <w:r>
-        <w:rPr>
-          <w:rFonts w:ascii="Calibri Light" w:hAnsi="Calibri Light" w:cs="Calibri Light"/>
-          <w:szCs w:val="24"/>
-          <w:lang w:val="en-US"/>
-        </w:rPr>
-        <w:t xml:space="preserve">(Blanchet </w:t>
-      </w:r>
-      <w:r>
-        <w:rPr>
-          <w:rFonts w:ascii="Calibri Light" w:hAnsi="Calibri Light" w:cs="Calibri Light"/>
-          <w:i/>
-          <w:iCs/>
-          <w:szCs w:val="24"/>
-          <w:lang w:val="en-US"/>
-        </w:rPr>
-        <w:t>et al.</w:t>
-      </w:r>
-      <w:r>
-        <w:rPr>
-          <w:rFonts w:ascii="Calibri Light" w:hAnsi="Calibri Light" w:cs="Calibri Light"/>
-          <w:szCs w:val="24"/>
-          <w:lang w:val="en-US"/>
-        </w:rPr>
-        <w:t>, 2025)</w:t>
-      </w:r>
-      <w:r>
-        <w:rPr>
-          <w:lang w:val="en-US"/>
-        </w:rPr>
-        <w:fldChar w:fldCharType="end"/>
-      </w:r>
-    </w:p>
-    <w:p>
-      <w:pPr>
-        <w:pStyle w:val="Paragraphedeliste"/>
-        <w:numPr>
-          <w:ilvl w:val="0"/>
-          <w:numId w:val="5"/>
-        </w:numPr>
-        <w:ind w:left="360"/>
-        <w:rPr>
-          <w:lang w:val="en-US"/>
-        </w:rPr>
-      </w:pPr>
-      <w:r>
-        <w:rPr>
-          <w:rStyle w:val="lev"/>
-          <w:lang w:val="en-US"/>
-        </w:rPr>
-        <w:t>Abundance/</w:t>
-      </w:r>
-      <w:r>
-        <w:rPr>
-          <w:rStyle w:val="lev"/>
-          <w:lang w:val="en-US"/>
-        </w:rPr>
-        <w:t>Density</w:t>
-      </w:r>
-      <w:r>
-        <w:rPr>
-          <w:rStyle w:val="lev"/>
-          <w:lang w:val="en-US"/>
-        </w:rPr>
-        <w:t xml:space="preserve">: </w:t>
-      </w:r>
-      <w:r>
-        <w:rPr>
-          <w:rStyle w:val="lev"/>
-          <w:b w:val="0"/>
-          <w:bCs w:val="0"/>
-          <w:lang w:val="en-US"/>
-        </w:rPr>
-        <w:t>total number of individuals per m²</w:t>
-      </w:r>
-    </w:p>
-    <w:p>
-      <w:pPr>
-        <w:pStyle w:val="Paragraphedeliste"/>
-        <w:numPr>
-          <w:ilvl w:val="0"/>
-          <w:numId w:val="5"/>
-        </w:numPr>
-        <w:ind w:left="360"/>
-        <w:rPr>
-          <w:rStyle w:val="lev"/>
-          <w:b w:val="0"/>
-          <w:bCs w:val="0"/>
-          <w:lang w:val="en-US"/>
-        </w:rPr>
-      </w:pPr>
-      <w:r>
-        <w:rPr>
-          <w:rStyle w:val="lev"/>
-          <w:lang w:val="en-US"/>
-        </w:rPr>
-        <w:t xml:space="preserve">Taxonomic Composition: </w:t>
-      </w:r>
-      <w:r>
-        <w:rPr>
-          <w:rStyle w:val="lev"/>
-          <w:b w:val="0"/>
-          <w:bCs w:val="0"/>
-          <w:lang w:val="en-US"/>
-        </w:rPr>
-        <w:t>p</w:t>
-      </w:r>
-      <w:r>
-        <w:rPr>
-          <w:lang w:val="en-US"/>
-        </w:rPr>
-        <w:t>resence and dominance of specific taxonomic groups (e.g., polychaetes, mollusks, crustaceans) (</w:t>
-      </w:r>
-      <w:r>
-        <w:rPr>
-          <w:lang w:val="en-US"/>
-        </w:rPr>
-        <w:t>s</w:t>
-      </w:r>
-      <w:r>
-        <w:rPr>
-          <w:lang w:val="en-US"/>
-        </w:rPr>
-        <w:t>ensitive to pollution and organic enrichment</w:t>
-      </w:r>
-      <w:r>
-        <w:rPr>
-          <w:lang w:val="en-US"/>
-        </w:rPr>
-        <w:t>)</w:t>
-      </w:r>
-      <w:bookmarkStart w:id="2" w:name="_Hlk204160043"/>
-    </w:p>
-    <w:p>
-      <w:pPr>
-        <w:pStyle w:val="Paragraphedeliste"/>
-        <w:numPr>
-          <w:ilvl w:val="0"/>
-          <w:numId w:val="5"/>
-        </w:numPr>
-        <w:ind w:left="360"/>
-        <w:rPr>
-          <w:rStyle w:val="lev"/>
-          <w:b w:val="0"/>
-          <w:bCs w:val="0"/>
-          <w:lang w:val="en-US"/>
-        </w:rPr>
-      </w:pPr>
-      <w:bookmarkStart w:id="3" w:name="_Hlk204160036"/>
-      <w:bookmarkStart w:id="4" w:name="_Hlk204160015"/>
-      <w:bookmarkEnd w:id="2"/>
-      <w:r>
-        <w:rPr>
-          <w:rStyle w:val="lev"/>
-          <w:lang w:val="en-US"/>
-        </w:rPr>
-        <w:t xml:space="preserve">Ecological Quality Ratios </w:t>
-      </w:r>
-      <w:r>
-        <w:rPr>
-          <w:rStyle w:val="lev"/>
-          <w:lang w:val="en-US"/>
-        </w:rPr>
-        <w:t>(EQR)</w:t>
-      </w:r>
-    </w:p>
-    <w:p>
-      <w:pPr>
-        <w:pStyle w:val="Paragraphedeliste"/>
-        <w:numPr>
-          <w:ilvl w:val="1"/>
-          <w:numId w:val="5"/>
-        </w:numPr>
-        <w:rPr>
-          <w:rStyle w:val="lev"/>
-          <w:b w:val="0"/>
-          <w:bCs w:val="0"/>
-          <w:lang w:val="en-US"/>
-        </w:rPr>
-      </w:pPr>
-      <w:r>
-        <w:rPr>
-          <w:rStyle w:val="lev"/>
-          <w:lang w:val="en-US"/>
-        </w:rPr>
-        <w:t xml:space="preserve">EQR-AMBI </w:t>
-      </w:r>
-      <w:r>
-        <w:rPr>
-          <w:rStyle w:val="lev"/>
-          <w:lang w:val="en-US"/>
-        </w:rPr>
-        <w:t xml:space="preserve">(AZTI Marine Biotic Index): </w:t>
-      </w:r>
-    </w:p>
-    <w:p>
-      <w:pPr>
-        <w:ind w:left="1080"/>
-        <w:rPr>
-          <w:rStyle w:val="lev"/>
-          <w:b w:val="0"/>
-          <w:bCs w:val="0"/>
-          <w:lang w:val="en-US"/>
-        </w:rPr>
-      </w:pPr>
-      <w:r>
-        <w:rPr>
-          <w:rStyle w:val="lev"/>
-          <w:lang w:val="en-US"/>
-        </w:rPr>
-        <w:t xml:space="preserve">AMBI is a score of anthropic disturbance response </w:t>
-      </w:r>
-      <w:r>
-        <w:rPr>
-          <w:rStyle w:val="lev"/>
-          <w:lang w:val="en-US"/>
-        </w:rPr>
-        <w:fldChar w:fldCharType="begin"/>
-      </w:r>
-      <w:r>
-        <w:rPr>
-          <w:rStyle w:val="lev"/>
-          <w:lang w:val="en-US"/>
-        </w:rPr>
-        <w:instrText xml:space="preserve"> ADDIN ZOTERO_ITEM CSL_CITATION {"citationID":"aNZrFm7f","properties":{"formattedCitation":"(Borja, Franco et P\\uc0\\u233{}rez, 2000; Borja et Muxika, 2005)","plainCitation":"(Borja, Franco et Pérez, 2000; Borja et Muxika, 2005)","noteIndex":0},"citationItems":[{"id":1195,"uris":["http://zotero.org/users/3305729/items/T3IM36NU"],"itemData":{"id":1195,"type":"article-journal","abstract":"In this paper, a marine Biotic Index (BI) for soft-bottom benthos of European estuarine and coastal environments is proposed. This is derived from the proportions of individual abundance in five ecological groups, which are related to the degree of sensitivity/tolerance to an environmental stress gradient. The main difference with previously published indices is the use of a simple formula that produces a continuous Biotic Coefficient (BC) – which makes it more suitable for statistical analysis, in opposition with previous discreet biotic indices – not affected by subjectivity. Relationships between this coefficient and a complementary BI with several environmental variables are discussed. Finally, a validation of the proposed index is made with data from systems affected by recent human disturbances, showing that different anthropogenic changes in the environment can be detected through the use of this BI.","container-title":"Marine Pollution Bulletin","DOI":"10.1016/S0025-326X(00)00061-8","ISSN":"0025-326X","issue":"12","journalAbbreviation":"Marine Pollution Bulletin","page":"1100-1114","source":"ScienceDirect","title":"A Marine Biotic Index to Establish the Ecological Quality of Soft-Bottom Benthos Within European Estuarine and Coastal Environments","volume":"40","author":[{"family":"Borja","given":"A"},{"family":"Franco","given":"J"},{"family":"Pérez","given":"V"}],"issued":{"date-parts":[["2000",12,1]]},"citation-key":"borjaMarineBioticIndex2000"}},{"id":1190,"uris":["http://zotero.org/users/3305729/items/TNCZRY8P"],"itemData":{"id":1190,"type":"article-journal","container-title":"Marine Pollution Bulletin","DOI":"10.1016/j.marpolbul.2005.04.040","ISSN":"0025-326X","issue":"7","journalAbbreviation":"Marine Pollution Bulletin","page":"787-789","source":"ScienceDirect","title":"Guidelines for the use of AMBI (AZTI’s Marine Biotic Index) in the assessment of the benthic ecological quality","volume":"50","author":[{"family":"Borja","given":"Angel"},{"family":"Muxika","given":"Iñigo"}],"issued":{"date-parts":[["2005",7,1]]},"citation-key":"borjaGuidelinesUseAMBI2005"}}],"schema":"https://github.com/citation-style-language/schema/raw/master/csl-citation.json"} </w:instrText>
-      </w:r>
-      <w:r>
-        <w:rPr>
-          <w:rStyle w:val="lev"/>
-          <w:lang w:val="en-US"/>
-        </w:rPr>
-        <w:fldChar w:fldCharType="separate"/>
-      </w:r>
-      <w:r>
-        <w:rPr>
-          <w:rFonts w:ascii="Calibri Light" w:hAnsi="Calibri Light" w:cs="Calibri Light"/>
-          <w:szCs w:val="24"/>
-          <w:lang w:val="en-US"/>
-        </w:rPr>
-        <w:t>(Borja, Franco et Pérez, 2000; Borja et Muxika, 2005)</w:t>
-      </w:r>
-      <w:r>
-        <w:rPr>
-          <w:rStyle w:val="lev"/>
-          <w:lang w:val="en-US"/>
-        </w:rPr>
-        <w:fldChar w:fldCharType="end"/>
-      </w:r>
-    </w:p>
-    <w:p>
-      <w:pPr>
-        <w:ind w:left="1080"/>
-        <w:rPr>
-          <w:lang w:val="en-US"/>
-        </w:rPr>
-      </w:pPr>
-      <w:r>
-        <w:rPr>
-          <w:lang w:val="en-US"/>
-        </w:rPr>
-        <w:t xml:space="preserve">First needs to </w:t>
-      </w:r>
-      <w:r>
-        <w:rPr>
-          <w:lang w:val="en-US"/>
-        </w:rPr>
-        <w:t>assign</w:t>
-      </w:r>
-      <w:r>
-        <w:rPr>
-          <w:lang w:val="en-US"/>
-        </w:rPr>
-        <w:t xml:space="preserve"> </w:t>
-      </w:r>
-      <w:r>
-        <w:rPr>
-          <w:lang w:val="en-US"/>
-        </w:rPr>
-        <w:t xml:space="preserve">species to </w:t>
-      </w:r>
-      <w:r>
-        <w:rPr>
-          <w:rStyle w:val="lev"/>
-          <w:lang w:val="en-US"/>
-        </w:rPr>
-        <w:t>5 ecological groups</w:t>
-      </w:r>
-      <w:r>
-        <w:rPr>
-          <w:lang w:val="en-US"/>
-        </w:rPr>
-        <w:t xml:space="preserve"> from sensitive to opportunistic, reflecting their tolerance to organic enrichment and pollution</w:t>
-      </w:r>
-      <w:r>
-        <w:rPr>
-          <w:lang w:val="en-US"/>
-        </w:rPr>
-        <w:t xml:space="preserve"> (</w:t>
-      </w:r>
-      <w:r>
-        <w:rPr>
-          <w:lang w:val="en-US"/>
-        </w:rPr>
-        <w:t>GI: sensitive species; GII: indifferent species; GIII: tolerant species; GIV: second-order opportunistic species; GV: first-order opportunistic species</w:t>
-      </w:r>
-      <w:r>
-        <w:rPr>
-          <w:lang w:val="en-US"/>
-        </w:rPr>
-        <w:t xml:space="preserve">). Than compute AMBI value following the equation using the function </w:t>
-      </w:r>
+        <w:pStyle w:val="Titre3"/>
+        <w:rPr>
+          <w:highlight w:val="yellow"/>
+          <w:lang w:val="en-US"/>
+        </w:rPr>
+      </w:pPr>
       <w:proofErr w:type="spellStart"/>
       <w:r>
         <w:rPr>
-          <w:lang w:val="en-US"/>
-        </w:rPr>
-        <w:t>ambi</w:t>
-      </w:r>
-      <w:proofErr w:type="spellEnd"/>
-      <w:r>
-        <w:rPr>
-          <w:lang w:val="en-US"/>
-        </w:rPr>
-        <w:t xml:space="preserve"> from the package {benthos} :</w:t>
-      </w:r>
-    </w:p>
-    <w:p>
-      <w:pPr>
-        <w:rPr>
-          <w:rFonts w:eastAsiaTheme="minorEastAsia"/>
-          <w:lang w:val="en-US"/>
-        </w:rPr>
-      </w:pPr>
-      <m:oMathPara>
-        <m:oMath>
-          <m:r>
-            <w:rPr>
-              <w:rFonts w:ascii="Cambria Math" w:hAnsi="Cambria Math"/>
-              <w:lang w:val="en-US"/>
-            </w:rPr>
-            <m:t xml:space="preserve">AMBI= </m:t>
-          </m:r>
-          <m:f>
-            <m:fPr>
-              <m:ctrlPr>
-                <w:rPr>
-                  <w:rFonts w:ascii="Cambria Math" w:hAnsi="Cambria Math"/>
-                  <w:i/>
-                  <w:lang w:val="en-US"/>
-                </w:rPr>
-              </m:ctrlPr>
-            </m:fPr>
-            <m:num>
-              <m:r>
-                <w:rPr>
-                  <w:rFonts w:ascii="Cambria Math" w:hAnsi="Cambria Math"/>
-                  <w:lang w:val="en-US"/>
-                </w:rPr>
-                <m:t>0*%GI+1.5*%GII+3*%GIII+4.5*%GIV+6*%GV</m:t>
-              </m:r>
-            </m:num>
-            <m:den>
-              <m:r>
-                <w:rPr>
-                  <w:rFonts w:ascii="Cambria Math" w:hAnsi="Cambria Math"/>
-                  <w:lang w:val="en-US"/>
-                </w:rPr>
-                <m:t>100</m:t>
-              </m:r>
-            </m:den>
-          </m:f>
-        </m:oMath>
-      </m:oMathPara>
-    </w:p>
-    <w:p>
-      <w:pPr>
-        <w:pStyle w:val="Paragraphedeliste"/>
-        <w:ind w:left="1440"/>
-        <w:rPr>
-          <w:lang w:val="en-US"/>
-        </w:rPr>
-      </w:pPr>
-      <w:r>
-        <w:rPr>
-          <w:rStyle w:val="lev"/>
-          <w:b w:val="0"/>
-          <w:bCs w:val="0"/>
-          <w:lang w:val="en-US"/>
-        </w:rPr>
-        <w:t xml:space="preserve">EQR(AMBI) has been computed from </w:t>
-      </w:r>
-      <w:r>
-        <w:fldChar w:fldCharType="begin"/>
-      </w:r>
-      <w:r>
-        <w:rPr>
-          <w:lang w:val="en-US"/>
-        </w:rPr>
-        <w:instrText xml:space="preserve"> ADDIN ZOTERO_ITEM CSL_CITATION {"citationID":"EN9jswjx","properties":{"formattedCitation":"(Blanchet {\\i{}et al.}, 2025)","plainCitation":"(Blanchet et al., 2025)","noteIndex":0},"citationItems":[{"id":1204,"uris":["http://zotero.org/users/3305729/items/Q875VASZ"],"itemData":{"id":1204,"type":"report","collection-title":"Rapport Université de Bordeaux/UMR EPOC &amp; Ifremer.","language":"fr","source":"Zotero","title":"Méthodologie pour la surveillance et l’évaluation du paramètre « Macro-invertébrés benthiques » dans les masses d’eau de transition estuariennes de la façade Manche- Atlantique –","URL":"https://archimer.ifremer.fr/doc/00887/99923/118418.pdf","author":[{"family":"Blanchet","given":"Hugues"},{"family":"Fouet","given":"Marie"},{"family":"Bizzozero","given":"Lucie"},{"family":"Foveau","given":"Aurélie"}],"accessed":{"date-parts":[["2025",7,9]]},"issued":{"date-parts":[["2025",3]]},"citation-key":"blanchetMethodologiePourSurveillance2025"}}],"schema":"https://github.com/citation-style-language/schema/raw/master/csl-citation.json"} </w:instrText>
-      </w:r>
-      <w:r>
-        <w:fldChar w:fldCharType="separate"/>
-      </w:r>
-      <w:r>
-        <w:rPr>
-          <w:rFonts w:ascii="Calibri Light" w:hAnsi="Calibri Light" w:cs="Calibri Light"/>
-          <w:szCs w:val="24"/>
-          <w:lang w:val="en-US"/>
-        </w:rPr>
-        <w:t xml:space="preserve">(Blanchet </w:t>
-      </w:r>
-      <w:r>
-        <w:rPr>
-          <w:rFonts w:ascii="Calibri Light" w:hAnsi="Calibri Light" w:cs="Calibri Light"/>
-          <w:i/>
-          <w:iCs/>
-          <w:szCs w:val="24"/>
-          <w:lang w:val="en-US"/>
-        </w:rPr>
-        <w:t>et al.</w:t>
-      </w:r>
-      <w:r>
-        <w:rPr>
-          <w:rFonts w:ascii="Calibri Light" w:hAnsi="Calibri Light" w:cs="Calibri Light"/>
-          <w:szCs w:val="24"/>
-          <w:lang w:val="en-US"/>
-        </w:rPr>
-        <w:t>, 2025)</w:t>
-      </w:r>
-      <w:r>
-        <w:fldChar w:fldCharType="end"/>
-      </w:r>
-      <w:r>
-        <w:rPr>
-          <w:lang w:val="en-US"/>
-        </w:rPr>
-        <w:t xml:space="preserve"> </w:t>
-      </w:r>
-      <w:r>
-        <w:rPr>
-          <w:lang w:val="en-US"/>
-        </w:rPr>
-        <w:t>methodology.</w:t>
-      </w:r>
-    </w:p>
-    <w:p>
-      <m:oMathPara>
-        <m:oMath>
-          <m:r>
-            <w:rPr>
-              <w:rFonts w:ascii="Cambria Math" w:hAnsi="Cambria Math"/>
-            </w:rPr>
-            <m:t>EQR</m:t>
-          </m:r>
-          <m:d>
-            <m:dPr>
-              <m:ctrlPr>
-                <w:rPr>
-                  <w:rFonts w:ascii="Cambria Math" w:hAnsi="Cambria Math"/>
-                  <w:i/>
-                </w:rPr>
-              </m:ctrlPr>
-            </m:dPr>
-            <m:e>
-              <m:r>
-                <w:rPr>
-                  <w:rFonts w:ascii="Cambria Math" w:hAnsi="Cambria Math"/>
-                </w:rPr>
-                <m:t>AMBI</m:t>
-              </m:r>
-            </m:e>
-          </m:d>
-          <m:r>
-            <w:rPr>
-              <w:rFonts w:ascii="Cambria Math" w:hAnsi="Cambria Math"/>
-            </w:rPr>
-            <m:t xml:space="preserve">= </m:t>
-          </m:r>
-          <m:f>
-            <m:fPr>
-              <m:ctrlPr>
-                <w:rPr>
-                  <w:rFonts w:ascii="Cambria Math" w:hAnsi="Cambria Math"/>
-                  <w:i/>
-                </w:rPr>
-              </m:ctrlPr>
-            </m:fPr>
-            <m:num>
-              <m:r>
-                <w:rPr>
-                  <w:rFonts w:ascii="Cambria Math" w:hAnsi="Cambria Math"/>
-                </w:rPr>
-                <m:t>AMBI-7</m:t>
-              </m:r>
-            </m:num>
-            <m:den>
-              <m:sSub>
-                <m:sSubPr>
-                  <m:ctrlPr>
-                    <w:rPr>
-                      <w:rFonts w:ascii="Cambria Math" w:hAnsi="Cambria Math"/>
-                      <w:i/>
-                    </w:rPr>
-                  </m:ctrlPr>
-                </m:sSubPr>
-                <m:e>
-                  <m:r>
-                    <w:rPr>
-                      <w:rFonts w:ascii="Cambria Math" w:hAnsi="Cambria Math"/>
-                    </w:rPr>
-                    <m:t>AMBI</m:t>
-                  </m:r>
-                </m:e>
-                <m:sub>
-                  <m:r>
-                    <w:rPr>
-                      <w:rFonts w:ascii="Cambria Math" w:hAnsi="Cambria Math"/>
-                    </w:rPr>
-                    <m:t>ref</m:t>
-                  </m:r>
-                </m:sub>
-              </m:sSub>
-              <m:r>
-                <w:rPr>
-                  <w:rFonts w:ascii="Cambria Math" w:hAnsi="Cambria Math"/>
-                </w:rPr>
-                <m:t>-7</m:t>
-              </m:r>
-            </m:den>
-          </m:f>
-        </m:oMath>
-      </m:oMathPara>
-    </w:p>
-    <w:tbl>
-      <w:tblPr>
-        <w:tblStyle w:val="Grilledutableau"/>
-        <w:tblW w:w="0" w:type="auto"/>
-        <w:tblLook w:val="04A0" w:firstRow="1" w:lastRow="0" w:firstColumn="1" w:lastColumn="0" w:noHBand="0" w:noVBand="1"/>
-      </w:tblPr>
-      <w:tblGrid>
-        <w:gridCol w:w="1742"/>
-        <w:gridCol w:w="1742"/>
-        <w:gridCol w:w="1743"/>
-        <w:gridCol w:w="1743"/>
-        <w:gridCol w:w="1743"/>
-        <w:gridCol w:w="1743"/>
-      </w:tblGrid>
-      <w:tr>
-        <w:tc>
-          <w:tcPr>
-            <w:tcW w:w="1742" w:type="dxa"/>
-          </w:tcPr>
-          <w:p>
-            <w:pPr>
-              <w:pStyle w:val="Sansinterligne"/>
-              <w:rPr>
-                <w:lang w:val="en-US"/>
-              </w:rPr>
-            </w:pPr>
-            <w:r>
-              <w:rPr>
-                <w:lang w:val="en-US"/>
-              </w:rPr>
-              <w:t>Status</w:t>
-            </w:r>
-          </w:p>
-        </w:tc>
-        <w:tc>
-          <w:tcPr>
-            <w:tcW w:w="1742" w:type="dxa"/>
-          </w:tcPr>
-          <w:p>
-            <w:pPr>
-              <w:pStyle w:val="Sansinterligne"/>
-              <w:rPr>
-                <w:lang w:val="en-US"/>
-              </w:rPr>
-            </w:pPr>
-            <w:r>
-              <w:rPr>
-                <w:lang w:val="en-US"/>
-              </w:rPr>
-              <w:t>High</w:t>
-            </w:r>
-          </w:p>
-        </w:tc>
-        <w:tc>
-          <w:tcPr>
-            <w:tcW w:w="1743" w:type="dxa"/>
-          </w:tcPr>
-          <w:p>
-            <w:pPr>
-              <w:pStyle w:val="Sansinterligne"/>
-              <w:rPr>
-                <w:lang w:val="en-US"/>
-              </w:rPr>
-            </w:pPr>
-            <w:r>
-              <w:rPr>
-                <w:lang w:val="en-US"/>
-              </w:rPr>
-              <w:t>Good</w:t>
-            </w:r>
-          </w:p>
-        </w:tc>
-        <w:tc>
-          <w:tcPr>
-            <w:tcW w:w="1743" w:type="dxa"/>
-          </w:tcPr>
-          <w:p>
-            <w:pPr>
-              <w:pStyle w:val="Sansinterligne"/>
-              <w:rPr>
-                <w:lang w:val="en-US"/>
-              </w:rPr>
-            </w:pPr>
-            <w:r>
-              <w:rPr>
-                <w:lang w:val="en-US"/>
-              </w:rPr>
-              <w:t>Moderate</w:t>
-            </w:r>
-          </w:p>
-        </w:tc>
-        <w:tc>
-          <w:tcPr>
-            <w:tcW w:w="1743" w:type="dxa"/>
-          </w:tcPr>
-          <w:p>
-            <w:pPr>
-              <w:pStyle w:val="Sansinterligne"/>
-              <w:rPr>
-                <w:lang w:val="en-US"/>
-              </w:rPr>
-            </w:pPr>
-            <w:r>
-              <w:rPr>
-                <w:lang w:val="en-US"/>
-              </w:rPr>
-              <w:t>Poor</w:t>
-            </w:r>
-          </w:p>
-        </w:tc>
-        <w:tc>
-          <w:tcPr>
-            <w:tcW w:w="1743" w:type="dxa"/>
-          </w:tcPr>
-          <w:p>
-            <w:pPr>
-              <w:pStyle w:val="Sansinterligne"/>
-              <w:rPr>
-                <w:lang w:val="en-US"/>
-              </w:rPr>
-            </w:pPr>
-            <w:r>
-              <w:rPr>
-                <w:lang w:val="en-US"/>
-              </w:rPr>
-              <w:t>Bad</w:t>
-            </w:r>
-          </w:p>
-        </w:tc>
-      </w:tr>
-      <w:tr>
-        <w:tc>
-          <w:tcPr>
-            <w:tcW w:w="1742" w:type="dxa"/>
-          </w:tcPr>
-          <w:p>
-            <w:pPr>
-              <w:pStyle w:val="Sansinterligne"/>
-              <w:rPr>
-                <w:lang w:val="en-US"/>
-              </w:rPr>
-            </w:pPr>
-            <w:r>
-              <w:rPr>
-                <w:lang w:val="en-US"/>
-              </w:rPr>
-              <w:t>EQR boundaries</w:t>
-            </w:r>
-          </w:p>
-        </w:tc>
-        <w:tc>
-          <w:tcPr>
-            <w:tcW w:w="1742" w:type="dxa"/>
-          </w:tcPr>
-          <w:p>
-            <w:pPr>
-              <w:pStyle w:val="Sansinterligne"/>
-              <w:rPr>
-                <w:lang w:val="en-US"/>
-              </w:rPr>
-            </w:pPr>
-            <w:r>
-              <w:rPr>
-                <w:lang w:val="en-US"/>
-              </w:rPr>
-              <w:t>]1-0,8]</w:t>
-            </w:r>
-          </w:p>
-        </w:tc>
-        <w:tc>
-          <w:tcPr>
-            <w:tcW w:w="1743" w:type="dxa"/>
-          </w:tcPr>
-          <w:p>
-            <w:pPr>
-              <w:pStyle w:val="Sansinterligne"/>
-              <w:rPr>
-                <w:lang w:val="en-US"/>
-              </w:rPr>
-            </w:pPr>
-            <w:r>
-              <w:rPr>
-                <w:lang w:val="en-US"/>
-              </w:rPr>
-              <w:t>]0,8-0,6]</w:t>
-            </w:r>
-          </w:p>
-        </w:tc>
-        <w:tc>
-          <w:tcPr>
-            <w:tcW w:w="1743" w:type="dxa"/>
-          </w:tcPr>
-          <w:p>
-            <w:pPr>
-              <w:pStyle w:val="Sansinterligne"/>
-              <w:rPr>
-                <w:lang w:val="en-US"/>
-              </w:rPr>
-            </w:pPr>
-            <w:r>
-              <w:rPr>
-                <w:lang w:val="en-US"/>
-              </w:rPr>
-              <w:t>]0,6-0,4]</w:t>
-            </w:r>
-          </w:p>
-        </w:tc>
-        <w:tc>
-          <w:tcPr>
-            <w:tcW w:w="1743" w:type="dxa"/>
-          </w:tcPr>
-          <w:p>
-            <w:pPr>
-              <w:pStyle w:val="Sansinterligne"/>
-              <w:rPr>
-                <w:lang w:val="en-US"/>
-              </w:rPr>
-            </w:pPr>
-            <w:r>
-              <w:rPr>
-                <w:lang w:val="en-US"/>
-              </w:rPr>
-              <w:t>]0,4-0,2]</w:t>
-            </w:r>
-          </w:p>
-        </w:tc>
-        <w:tc>
-          <w:tcPr>
-            <w:tcW w:w="1743" w:type="dxa"/>
-          </w:tcPr>
-          <w:p>
-            <w:pPr>
-              <w:pStyle w:val="Sansinterligne"/>
-              <w:rPr>
-                <w:lang w:val="en-US"/>
-              </w:rPr>
-            </w:pPr>
-            <w:r>
-              <w:rPr>
-                <w:lang w:val="en-US"/>
-              </w:rPr>
-              <w:t>]0,2-0]</w:t>
-            </w:r>
-          </w:p>
-        </w:tc>
-      </w:tr>
-    </w:tbl>
-    <w:p>
-      <w:pPr>
-        <w:ind w:left="360"/>
-      </w:pPr>
-    </w:p>
-    <w:bookmarkEnd w:id="3"/>
-    <w:p>
-      <w:pPr>
-        <w:pStyle w:val="Paragraphedeliste"/>
-        <w:numPr>
-          <w:ilvl w:val="1"/>
-          <w:numId w:val="5"/>
-        </w:numPr>
-        <w:rPr>
-          <w:lang w:val="en-US"/>
-        </w:rPr>
-      </w:pPr>
-      <w:r>
-        <w:rPr>
-          <w:b/>
-          <w:bCs/>
-          <w:lang w:val="en-US"/>
-        </w:rPr>
-        <w:lastRenderedPageBreak/>
-        <w:t>BEQI-FR (French Benthic Ecosystem Quality Index):</w:t>
-      </w:r>
-      <w:r>
-        <w:rPr>
-          <w:lang w:val="en-US"/>
-        </w:rPr>
-        <w:t xml:space="preserve"> adopted indicator for assessing the quality of estuarine transitional water bodies in mainland France </w:t>
-      </w:r>
-      <w:r>
-        <w:rPr>
-          <w:lang w:val="en-US"/>
-        </w:rPr>
-        <w:fldChar w:fldCharType="begin"/>
-      </w:r>
-      <w:r>
-        <w:rPr>
-          <w:lang w:val="en-US"/>
-        </w:rPr>
-        <w:instrText xml:space="preserve"> ADDIN ZOTERO_ITEM CSL_CITATION {"citationID":"6djPL60O","properties":{"formattedCitation":"(Fouet {\\i{}et al.}, 2018; Fouet, Blanchet et Lepage, 2020; Blanchet {\\i{}et al.}, 2025)","plainCitation":"(Fouet et al., 2018; Fouet, Blanchet et Lepage, 2020; Blanchet et al., 2025)","noteIndex":0},"citationItems":[{"id":1186,"uris":["http://zotero.org/users/3305729/items/6PJW97GI"],"itemData":{"id":1186,"type":"report","number":"DOC00085633","page":"77","publisher":"Agence française pour la biodiversité - AFB, Université de Bordeaux Irstea","title":"Sélection d’un indicateur DCE « faune benthique invertébrée » adapté aux estuaires","URL":"https://professionnels.ofb.fr/fr/doc/selection-dun-indicateur-dce-faune-benthique-invertebree-adapte-aux-estuaires","author":[{"family":"Fouet","given":"Marie"},{"family":"Blanchet","given":"Hugues"},{"family":"Leconte","given":"Michel"},{"family":"David","given":"Valérie"},{"family":"Lepage","given":"Mario"}],"accessed":{"date-parts":[["2025",7,8]]},"issued":{"date-parts":[["2018",10]]},"citation-key":"fouetSelectionDunIndicateur2018"}},{"id":1205,"uris":["http://zotero.org/users/3305729/items/2QE4R2S7"],"itemData":{"id":1205,"type":"report","genre":"Water framework directive","title":"Intercalibration of biological elements for French transitional water bodies: benthic invertebrates","author":[{"family":"Fouet","given":"Marie"},{"family":"Blanchet","given":"Hugues"},{"family":"Lepage","given":"Mario"}],"issued":{"date-parts":[["2020",10]]},"citation-key":"fouetIntercalibrationBiologicalElements2020"}},{"id":1204,"uris":["http://zotero.org/users/3305729/items/Q875VASZ"],"itemData":{"id":1204,"type":"report","collection-title":"Rapport Université de Bordeaux/UMR EPOC &amp; Ifremer.","language":"fr","source":"Zotero","title":"Méthodologie pour la surveillance et l’évaluation du paramètre « Macro-invertébrés benthiques » dans les masses d’eau de transition estuariennes de la façade Manche- Atlantique –","URL":"https://archimer.ifremer.fr/doc/00887/99923/118418.pdf","author":[{"family":"Blanchet","given":"Hugues"},{"family":"Fouet","given":"Marie"},{"family":"Bizzozero","given":"Lucie"},{"family":"Foveau","given":"Aurélie"}],"accessed":{"date-parts":[["2025",7,9]]},"issued":{"date-parts":[["2025",3]]},"citation-key":"blanchetMethodologiePourSurveillance2025"}}],"schema":"https://github.com/citation-style-language/schema/raw/master/csl-citation.json"} </w:instrText>
-      </w:r>
-      <w:r>
-        <w:rPr>
-          <w:lang w:val="en-US"/>
-        </w:rPr>
-        <w:fldChar w:fldCharType="separate"/>
-      </w:r>
-      <w:r>
-        <w:rPr>
-          <w:rFonts w:ascii="Calibri Light" w:hAnsi="Calibri Light" w:cs="Calibri Light"/>
-          <w:szCs w:val="24"/>
-          <w:lang w:val="en-US"/>
-        </w:rPr>
-        <w:t xml:space="preserve">(Fouet </w:t>
-      </w:r>
-      <w:r>
-        <w:rPr>
-          <w:rFonts w:ascii="Calibri Light" w:hAnsi="Calibri Light" w:cs="Calibri Light"/>
-          <w:i/>
-          <w:iCs/>
-          <w:szCs w:val="24"/>
-          <w:lang w:val="en-US"/>
-        </w:rPr>
-        <w:t>et al.</w:t>
-      </w:r>
-      <w:r>
-        <w:rPr>
-          <w:rFonts w:ascii="Calibri Light" w:hAnsi="Calibri Light" w:cs="Calibri Light"/>
-          <w:szCs w:val="24"/>
-          <w:lang w:val="en-US"/>
-        </w:rPr>
-        <w:t xml:space="preserve">, 2018; Fouet, Blanchet et Lepage, 2020; Blanchet </w:t>
-      </w:r>
-      <w:r>
-        <w:rPr>
-          <w:rFonts w:ascii="Calibri Light" w:hAnsi="Calibri Light" w:cs="Calibri Light"/>
-          <w:i/>
-          <w:iCs/>
-          <w:szCs w:val="24"/>
-          <w:lang w:val="en-US"/>
-        </w:rPr>
-        <w:t>et al.</w:t>
-      </w:r>
-      <w:r>
-        <w:rPr>
-          <w:rFonts w:ascii="Calibri Light" w:hAnsi="Calibri Light" w:cs="Calibri Light"/>
-          <w:szCs w:val="24"/>
-          <w:lang w:val="en-US"/>
-        </w:rPr>
-        <w:t>, 2025)</w:t>
-      </w:r>
-      <w:r>
-        <w:rPr>
-          <w:lang w:val="en-US"/>
-        </w:rPr>
-        <w:fldChar w:fldCharType="end"/>
-      </w:r>
-      <w:r>
-        <w:rPr>
-          <w:lang w:val="en-US"/>
-        </w:rPr>
-        <w:t xml:space="preserve">. This method combines the Ecological Quality Ratios (EQR, i.e., scoring method) of the AMBI index </w:t>
-      </w:r>
-      <w:r>
-        <w:rPr>
-          <w:lang w:val="en-US"/>
-        </w:rPr>
-        <w:fldChar w:fldCharType="begin"/>
-      </w:r>
-      <w:r>
-        <w:rPr>
-          <w:lang w:val="en-US"/>
-        </w:rPr>
-        <w:instrText xml:space="preserve"> ADDIN ZOTERO_ITEM CSL_CITATION {"citationID":"0Wsjqm5D","properties":{"formattedCitation":"(Borja, Franco et P\\uc0\\u233{}rez, 2000; van\\uc0\\u160{}Loon {\\i{}et al.}, 2015)","plainCitation":"(Borja, Franco et Pérez, 2000; van Loon et al., 2015)","noteIndex":0},"citationItems":[{"id":1195,"uris":["http://zotero.org/users/3305729/items/T3IM36NU"],"itemData":{"id":1195,"type":"article-journal","abstract":"In this paper, a marine Biotic Index (BI) for soft-bottom benthos of European estuarine and coastal environments is proposed. This is derived from the proportions of individual abundance in five ecological groups, which are related to the degree of sensitivity/tolerance to an environmental stress gradient. The main difference with previously published indices is the use of a simple formula that produces a continuous Biotic Coefficient (BC) – which makes it more suitable for statistical analysis, in opposition with previous discreet biotic indices – not affected by subjectivity. Relationships between this coefficient and a complementary BI with several environmental variables are discussed. Finally, a validation of the proposed index is made with data from systems affected by recent human disturbances, showing that different anthropogenic changes in the environment can be detected through the use of this BI.","container-title":"Marine Pollution Bulletin","DOI":"10.1016/S0025-326X(00)00061-8","ISSN":"0025-326X","issue":"12","journalAbbreviation":"Marine Pollution Bulletin","page":"1100-1114","source":"ScienceDirect","title":"A Marine Biotic Index to Establish the Ecological Quality of Soft-Bottom Benthos Within European Estuarine and Coastal Environments","volume":"40","author":[{"family":"Borja","given":"A"},{"family":"Franco","given":"J"},{"family":"Pérez","given":"V"}],"issued":{"date-parts":[["2000",12,1]]},"citation-key":"borjaMarineBioticIndex2000"}},{"id":1198,"uris":["http://zotero.org/users/3305729/items/W8ZI65EJ"],"itemData":{"id":1198,"type":"article-journal","abstract":"The Benthic Ecosystem Quality Index 2 (BEQI2) is the Dutch multi-metric index (MMI) for assessing the status and trend of benthic invertebrates in transitional and coastal waters for the Water Framework Directive (WFD). It contains the same indicators, i.e. species richness, Shannon index and AMBI, as in the multivariate m-AMBI. The latter MMI has been adopted by several European countries in the context of WFD implementation. In contrast to m-AMBI, the BEQI2 calculation procedure has been strongly simplified and consists of two steps, i.e. the separate indicator values are normalized using their long-term reference values resulting in three Ecological Quality Ratios (EQRs), which are subsequently averaged to give one BEQI2 value. Using this method only small numbers of samples need to be analysed by Dutch benthos laboratories annually, without the necessity to co-analyse a larger historical dataset. BEQI2 EQR values appeared to correlate quantitatively very well with m-AMBI EQR values. In addition, a data pooling procedure has been added to the BEQI2 tool which enables the pooling of small core samples (0.01–0.025m2) into larger standardized data pools of 0.1m2 in order to meet the data requirements of the AMBI indicator and to obtain comparable reference values. Furthermore, the BEQI2 tool automatically and efficiently converts species synonym names into standardized species names. The BEQI2 tool has been applied to all Dutch benthos data monitored by Rijkswaterstaat in the period of 1991–2010 in the transitional and coastal waters and salt lakes and these results are reported here for the first time. Reference values for species richness and Shannon index (99 percentile values) and AMBI reference values (1 percentile values) were estimated for all water body–ecotopes and are discussed. BEQI2 results for all these water bodies are discussed in view of natural and human pressures. The pressure sensitivity of the BEQI2 for sewage and dredging/dumping, via the state variables oxygen and suspended matter respectively, was demonstrated.","container-title":"Journal of Sea Research","DOI":"10.1016/j.seares.2015.05.002","ISSN":"1385-1101","journalAbbreviation":"Journal of Sea Research","page":"1-13","source":"ScienceDirect","title":"Application of the Benthic Ecosystem Quality Index 2 to benthos in Dutch transitional and coastal waters","volume":"103","author":[{"family":"Loon","given":"W. M. G. M.","non-dropping-particle":"van"},{"family":"Boon","given":"A. R."},{"family":"Gittenberger","given":"A."},{"family":"Walvoort","given":"D. J. J."},{"family":"Lavaleye","given":"M."},{"family":"Duineveld","given":"G. C. A."},{"family":"Verschoor","given":"A. J."}],"issued":{"date-parts":[["2015",9,1]]},"citation-key":"vanloonApplicationBenthicEcosystem2015"}}],"schema":"https://github.com/citation-style-language/schema/raw/master/csl-citation.json"} </w:instrText>
-      </w:r>
-      <w:r>
-        <w:rPr>
-          <w:lang w:val="en-US"/>
-        </w:rPr>
-        <w:fldChar w:fldCharType="separate"/>
-      </w:r>
-      <w:r>
-        <w:rPr>
-          <w:rFonts w:ascii="Calibri Light" w:hAnsi="Calibri Light" w:cs="Calibri Light"/>
-          <w:szCs w:val="24"/>
-          <w:lang w:val="en-US"/>
-        </w:rPr>
-        <w:t xml:space="preserve">(Borja, Franco et Pérez, 2000; van Loon </w:t>
-      </w:r>
-      <w:r>
-        <w:rPr>
-          <w:rFonts w:ascii="Calibri Light" w:hAnsi="Calibri Light" w:cs="Calibri Light"/>
-          <w:i/>
-          <w:iCs/>
-          <w:szCs w:val="24"/>
-          <w:lang w:val="en-US"/>
-        </w:rPr>
-        <w:t>et al.</w:t>
-      </w:r>
-      <w:r>
-        <w:rPr>
-          <w:rFonts w:ascii="Calibri Light" w:hAnsi="Calibri Light" w:cs="Calibri Light"/>
-          <w:szCs w:val="24"/>
-          <w:lang w:val="en-US"/>
-        </w:rPr>
-        <w:t>, 2015)</w:t>
-      </w:r>
-      <w:r>
-        <w:rPr>
-          <w:lang w:val="en-US"/>
-        </w:rPr>
-        <w:fldChar w:fldCharType="end"/>
-      </w:r>
-      <w:r>
-        <w:rPr>
-          <w:lang w:val="en-US"/>
-        </w:rPr>
-        <w:t>, the number of species (S), and the Shannon index (H'):</w:t>
-      </w:r>
-    </w:p>
-    <w:p>
-      <w:pPr>
-        <w:rPr>
-          <w:rFonts w:eastAsiaTheme="minorEastAsia"/>
-          <w:lang w:val="en-US"/>
-        </w:rPr>
-      </w:pPr>
-      <m:oMathPara>
-        <m:oMath>
-          <m:r>
-            <w:rPr>
-              <w:rFonts w:ascii="Cambria Math" w:hAnsi="Cambria Math"/>
-              <w:lang w:val="en-US"/>
-            </w:rPr>
-            <m:t xml:space="preserve">BEQI-FR= </m:t>
-          </m:r>
-          <m:f>
-            <m:fPr>
-              <m:ctrlPr>
-                <w:rPr>
-                  <w:rFonts w:ascii="Cambria Math" w:hAnsi="Cambria Math"/>
-                  <w:i/>
-                  <w:lang w:val="en-US"/>
-                </w:rPr>
-              </m:ctrlPr>
-            </m:fPr>
-            <m:num>
-              <m:f>
-                <m:fPr>
-                  <m:ctrlPr>
-                    <w:rPr>
-                      <w:rFonts w:ascii="Cambria Math" w:hAnsi="Cambria Math"/>
-                      <w:i/>
-                      <w:lang w:val="en-US"/>
-                    </w:rPr>
-                  </m:ctrlPr>
-                </m:fPr>
-                <m:num>
-                  <m:sSub>
-                    <m:sSubPr>
-                      <m:ctrlPr>
-                        <w:rPr>
-                          <w:rFonts w:ascii="Cambria Math" w:hAnsi="Cambria Math"/>
-                          <w:i/>
-                          <w:lang w:val="en-US"/>
-                        </w:rPr>
-                      </m:ctrlPr>
-                    </m:sSubPr>
-                    <m:e>
-                      <m:r>
-                        <w:rPr>
-                          <w:rFonts w:ascii="Cambria Math" w:hAnsi="Cambria Math"/>
-                          <w:lang w:val="en-US"/>
-                        </w:rPr>
-                        <m:t>S</m:t>
-                      </m:r>
-                    </m:e>
-                    <m:sub>
-                      <m:r>
-                        <w:rPr>
-                          <w:rFonts w:ascii="Cambria Math" w:hAnsi="Cambria Math"/>
-                          <w:lang w:val="en-US"/>
-                        </w:rPr>
-                        <m:t>obs</m:t>
-                      </m:r>
-                    </m:sub>
-                  </m:sSub>
-                </m:num>
-                <m:den>
-                  <m:sSub>
-                    <m:sSubPr>
-                      <m:ctrlPr>
-                        <w:rPr>
-                          <w:rFonts w:ascii="Cambria Math" w:hAnsi="Cambria Math"/>
-                          <w:i/>
-                          <w:lang w:val="en-US"/>
-                        </w:rPr>
-                      </m:ctrlPr>
-                    </m:sSubPr>
-                    <m:e>
-                      <m:r>
-                        <w:rPr>
-                          <w:rFonts w:ascii="Cambria Math" w:hAnsi="Cambria Math"/>
-                          <w:lang w:val="en-US"/>
-                        </w:rPr>
-                        <m:t>S</m:t>
-                      </m:r>
-                    </m:e>
-                    <m:sub>
-                      <m:r>
-                        <w:rPr>
-                          <w:rFonts w:ascii="Cambria Math" w:hAnsi="Cambria Math"/>
-                          <w:lang w:val="en-US"/>
-                        </w:rPr>
-                        <m:t>ref</m:t>
-                      </m:r>
-                    </m:sub>
-                  </m:sSub>
-                </m:den>
-              </m:f>
-              <m:r>
-                <w:rPr>
-                  <w:rFonts w:ascii="Cambria Math" w:hAnsi="Cambria Math"/>
-                  <w:lang w:val="en-US"/>
-                </w:rPr>
-                <m:t>+</m:t>
-              </m:r>
-              <m:f>
-                <m:fPr>
-                  <m:ctrlPr>
-                    <w:rPr>
-                      <w:rFonts w:ascii="Cambria Math" w:hAnsi="Cambria Math"/>
-                      <w:i/>
-                      <w:lang w:val="en-US"/>
-                    </w:rPr>
-                  </m:ctrlPr>
-                </m:fPr>
-                <m:num>
-                  <m:sSub>
-                    <m:sSubPr>
-                      <m:ctrlPr>
-                        <w:rPr>
-                          <w:rFonts w:ascii="Cambria Math" w:hAnsi="Cambria Math"/>
-                          <w:i/>
-                          <w:lang w:val="en-US"/>
-                        </w:rPr>
-                      </m:ctrlPr>
-                    </m:sSubPr>
-                    <m:e>
-                      <m:r>
-                        <w:rPr>
-                          <w:rFonts w:ascii="Cambria Math" w:hAnsi="Cambria Math"/>
-                          <w:lang w:val="en-US"/>
-                        </w:rPr>
-                        <m:t>H'</m:t>
-                      </m:r>
-                    </m:e>
-                    <m:sub>
-                      <m:r>
-                        <w:rPr>
-                          <w:rFonts w:ascii="Cambria Math" w:hAnsi="Cambria Math"/>
-                          <w:lang w:val="en-US"/>
-                        </w:rPr>
-                        <m:t>obs</m:t>
-                      </m:r>
-                    </m:sub>
-                  </m:sSub>
-                </m:num>
-                <m:den>
-                  <m:sSub>
-                    <m:sSubPr>
-                      <m:ctrlPr>
-                        <w:rPr>
-                          <w:rFonts w:ascii="Cambria Math" w:hAnsi="Cambria Math"/>
-                          <w:i/>
-                          <w:lang w:val="en-US"/>
-                        </w:rPr>
-                      </m:ctrlPr>
-                    </m:sSubPr>
-                    <m:e>
-                      <m:r>
-                        <w:rPr>
-                          <w:rFonts w:ascii="Cambria Math" w:hAnsi="Cambria Math"/>
-                          <w:lang w:val="en-US"/>
-                        </w:rPr>
-                        <m:t>H'</m:t>
-                      </m:r>
-                    </m:e>
-                    <m:sub>
-                      <m:r>
-                        <w:rPr>
-                          <w:rFonts w:ascii="Cambria Math" w:hAnsi="Cambria Math"/>
-                          <w:lang w:val="en-US"/>
-                        </w:rPr>
-                        <m:t>ref</m:t>
-                      </m:r>
-                    </m:sub>
-                  </m:sSub>
-                </m:den>
-              </m:f>
-              <m:r>
-                <w:rPr>
-                  <w:rFonts w:ascii="Cambria Math" w:hAnsi="Cambria Math"/>
-                  <w:lang w:val="en-US"/>
-                </w:rPr>
-                <m:t>+</m:t>
-              </m:r>
-              <m:f>
-                <m:fPr>
-                  <m:ctrlPr>
-                    <w:rPr>
-                      <w:rFonts w:ascii="Cambria Math" w:hAnsi="Cambria Math"/>
-                      <w:i/>
-                      <w:lang w:val="en-US"/>
-                    </w:rPr>
-                  </m:ctrlPr>
-                </m:fPr>
-                <m:num>
-                  <m:r>
-                    <w:rPr>
-                      <w:rFonts w:ascii="Cambria Math" w:hAnsi="Cambria Math"/>
-                      <w:lang w:val="en-US"/>
-                    </w:rPr>
-                    <m:t>(</m:t>
-                  </m:r>
-                  <m:sSub>
-                    <m:sSubPr>
-                      <m:ctrlPr>
-                        <w:rPr>
-                          <w:rFonts w:ascii="Cambria Math" w:hAnsi="Cambria Math"/>
-                          <w:i/>
-                          <w:lang w:val="en-US"/>
-                        </w:rPr>
-                      </m:ctrlPr>
-                    </m:sSubPr>
-                    <m:e>
-                      <m:r>
-                        <w:rPr>
-                          <w:rFonts w:ascii="Cambria Math" w:hAnsi="Cambria Math"/>
-                          <w:lang w:val="en-US"/>
-                        </w:rPr>
-                        <m:t>AMBI</m:t>
-                      </m:r>
-                    </m:e>
-                    <m:sub>
-                      <m:r>
-                        <w:rPr>
-                          <w:rFonts w:ascii="Cambria Math" w:hAnsi="Cambria Math"/>
-                          <w:lang w:val="en-US"/>
-                        </w:rPr>
-                        <m:t>obs</m:t>
-                      </m:r>
-                    </m:sub>
-                  </m:sSub>
-                  <m:r>
-                    <w:rPr>
-                      <w:rFonts w:ascii="Cambria Math" w:hAnsi="Cambria Math"/>
-                      <w:lang w:val="en-US"/>
-                    </w:rPr>
-                    <m:t>-7)</m:t>
-                  </m:r>
-                </m:num>
-                <m:den>
-                  <m:sSub>
-                    <m:sSubPr>
-                      <m:ctrlPr>
-                        <w:rPr>
-                          <w:rFonts w:ascii="Cambria Math" w:hAnsi="Cambria Math"/>
-                          <w:i/>
-                          <w:lang w:val="en-US"/>
-                        </w:rPr>
-                      </m:ctrlPr>
-                    </m:sSubPr>
-                    <m:e>
-                      <m:r>
-                        <w:rPr>
-                          <w:rFonts w:ascii="Cambria Math" w:hAnsi="Cambria Math"/>
-                          <w:lang w:val="en-US"/>
-                        </w:rPr>
-                        <m:t>(AMBI</m:t>
-                      </m:r>
-                    </m:e>
-                    <m:sub>
-                      <m:r>
-                        <w:rPr>
-                          <w:rFonts w:ascii="Cambria Math" w:hAnsi="Cambria Math"/>
-                          <w:lang w:val="en-US"/>
-                        </w:rPr>
-                        <m:t>ref</m:t>
-                      </m:r>
-                    </m:sub>
-                  </m:sSub>
-                  <m:r>
-                    <w:rPr>
-                      <w:rFonts w:ascii="Cambria Math" w:hAnsi="Cambria Math"/>
-                      <w:lang w:val="en-US"/>
-                    </w:rPr>
-                    <m:t>-7)</m:t>
-                  </m:r>
-                </m:den>
-              </m:f>
-              <m:r>
-                <w:rPr>
-                  <w:rFonts w:ascii="Cambria Math" w:hAnsi="Cambria Math"/>
-                  <w:lang w:val="en-US"/>
-                </w:rPr>
-                <m:t xml:space="preserve"> </m:t>
-              </m:r>
-            </m:num>
-            <m:den>
-              <m:r>
-                <w:rPr>
-                  <w:rFonts w:ascii="Cambria Math" w:hAnsi="Cambria Math"/>
-                  <w:lang w:val="en-US"/>
-                </w:rPr>
-                <m:t>3</m:t>
-              </m:r>
-            </m:den>
-          </m:f>
-        </m:oMath>
-      </m:oMathPara>
-    </w:p>
-    <w:p>
-      <w:pPr>
-        <w:pStyle w:val="Lgende"/>
-        <w:keepNext/>
-        <w:rPr>
-          <w:lang w:val="en-US"/>
-        </w:rPr>
-      </w:pPr>
-      <w:bookmarkStart w:id="5" w:name="_Hlk204160562"/>
-      <w:bookmarkEnd w:id="4"/>
-      <w:r>
-        <w:rPr>
-          <w:lang w:val="en-US"/>
-        </w:rPr>
-        <w:t xml:space="preserve">Table </w:t>
-      </w:r>
-      <w:r>
-        <w:fldChar w:fldCharType="begin"/>
-      </w:r>
-      <w:r>
-        <w:rPr>
-          <w:lang w:val="en-US"/>
-        </w:rPr>
-        <w:instrText xml:space="preserve"> SEQ Table \* ARABIC </w:instrText>
-      </w:r>
-      <w:r>
-        <w:fldChar w:fldCharType="separate"/>
-      </w:r>
-      <w:r>
-        <w:rPr>
-          <w:noProof/>
-          <w:lang w:val="en-US"/>
-        </w:rPr>
-        <w:t>1</w:t>
-      </w:r>
-      <w:r>
-        <w:fldChar w:fldCharType="end"/>
-      </w:r>
-      <w:r>
-        <w:rPr>
-          <w:lang w:val="en-US"/>
-        </w:rPr>
-        <w:t xml:space="preserve"> – </w:t>
-      </w:r>
-      <w:r>
-        <w:rPr>
-          <w:lang w:val="en-US"/>
-        </w:rPr>
-        <w:t>Estuaries sediment and macrobenthos characteristics and corresponding EUNIS habitat.</w:t>
-      </w:r>
-    </w:p>
-    <w:tbl>
-      <w:tblPr>
-        <w:tblStyle w:val="Grilledutableau"/>
-        <w:tblW w:w="9529" w:type="dxa"/>
-        <w:tblLook w:val="04A0" w:firstRow="1" w:lastRow="0" w:firstColumn="1" w:lastColumn="0" w:noHBand="0" w:noVBand="1"/>
-      </w:tblPr>
-      <w:tblGrid>
-        <w:gridCol w:w="778"/>
-        <w:gridCol w:w="848"/>
-        <w:gridCol w:w="1548"/>
-        <w:gridCol w:w="932"/>
-        <w:gridCol w:w="4111"/>
-        <w:gridCol w:w="1312"/>
-      </w:tblGrid>
-      <w:tr>
-        <w:tc>
-          <w:tcPr>
-            <w:tcW w:w="778" w:type="dxa"/>
-          </w:tcPr>
-          <w:p>
-            <w:pPr>
-              <w:pStyle w:val="Sansinterligne"/>
-              <w:rPr>
-                <w:lang w:val="en-US"/>
-              </w:rPr>
-            </w:pPr>
-            <w:r>
-              <w:rPr>
-                <w:lang w:val="en-US"/>
-              </w:rPr>
-              <w:t>Estuary</w:t>
-            </w:r>
-          </w:p>
-        </w:tc>
-        <w:tc>
-          <w:tcPr>
-            <w:tcW w:w="848" w:type="dxa"/>
-          </w:tcPr>
-          <w:p>
-            <w:pPr>
-              <w:pStyle w:val="Sansinterligne"/>
-              <w:rPr>
-                <w:lang w:val="en-US"/>
-              </w:rPr>
-            </w:pPr>
-            <w:r>
-              <w:rPr>
-                <w:lang w:val="en-US"/>
-              </w:rPr>
-              <w:t>Level</w:t>
-            </w:r>
-          </w:p>
-        </w:tc>
-        <w:tc>
-          <w:tcPr>
-            <w:tcW w:w="1548" w:type="dxa"/>
-          </w:tcPr>
-          <w:p>
-            <w:pPr>
-              <w:pStyle w:val="Sansinterligne"/>
-              <w:rPr>
-                <w:lang w:val="en-US"/>
-              </w:rPr>
-            </w:pPr>
-            <w:r>
-              <w:rPr>
-                <w:lang w:val="en-US"/>
-              </w:rPr>
-              <w:t>Main grain size</w:t>
-            </w:r>
-          </w:p>
-        </w:tc>
-        <w:tc>
-          <w:tcPr>
-            <w:tcW w:w="932" w:type="dxa"/>
-          </w:tcPr>
-          <w:p>
-            <w:pPr>
-              <w:pStyle w:val="Sansinterligne"/>
-              <w:rPr>
-                <w:lang w:val="en-US"/>
-              </w:rPr>
-            </w:pPr>
-            <w:r>
-              <w:rPr>
-                <w:lang w:val="en-US"/>
-              </w:rPr>
-              <w:t>Organic matter (% median [Q1-Q3])</w:t>
-            </w:r>
-          </w:p>
-        </w:tc>
-        <w:tc>
-          <w:tcPr>
-            <w:tcW w:w="4111" w:type="dxa"/>
-          </w:tcPr>
-          <w:p>
-            <w:pPr>
-              <w:pStyle w:val="Sansinterligne"/>
-              <w:rPr>
-                <w:lang w:val="en-US"/>
-              </w:rPr>
-            </w:pPr>
-            <w:r>
-              <w:rPr>
-                <w:lang w:val="en-US"/>
-              </w:rPr>
-              <w:t>Main phyla</w:t>
-            </w:r>
-          </w:p>
-        </w:tc>
-        <w:tc>
-          <w:tcPr>
-            <w:tcW w:w="1312" w:type="dxa"/>
-          </w:tcPr>
-          <w:p>
-            <w:pPr>
-              <w:pStyle w:val="Sansinterligne"/>
-              <w:rPr>
-                <w:lang w:val="en-US"/>
-              </w:rPr>
-            </w:pPr>
-            <w:r>
-              <w:rPr>
-                <w:lang w:val="en-US"/>
-              </w:rPr>
-              <w:t>EUNIS habitat</w:t>
-            </w:r>
-          </w:p>
-        </w:tc>
-      </w:tr>
-      <w:tr>
-        <w:tc>
-          <w:tcPr>
-            <w:tcW w:w="778" w:type="dxa"/>
-            <w:vMerge w:val="restart"/>
-          </w:tcPr>
-          <w:p>
-            <w:pPr>
-              <w:pStyle w:val="Sansinterligne"/>
-              <w:rPr>
-                <w:lang w:val="en-US"/>
-              </w:rPr>
-            </w:pPr>
-            <w:r>
-              <w:rPr>
-                <w:lang w:val="en-US"/>
-              </w:rPr>
-              <w:t>Gironde</w:t>
-            </w:r>
-          </w:p>
-        </w:tc>
-        <w:tc>
-          <w:tcPr>
-            <w:tcW w:w="848" w:type="dxa"/>
-          </w:tcPr>
-          <w:p>
-            <w:pPr>
-              <w:pStyle w:val="Sansinterligne"/>
-              <w:rPr>
-                <w:lang w:val="en-US"/>
-              </w:rPr>
-            </w:pPr>
-            <w:r>
-              <w:rPr>
-                <w:lang w:val="en-US"/>
-              </w:rPr>
-              <w:t>Intertidal</w:t>
-            </w:r>
-          </w:p>
-        </w:tc>
-        <w:tc>
-          <w:tcPr>
-            <w:tcW w:w="1548" w:type="dxa"/>
-          </w:tcPr>
-          <w:p>
-            <w:pPr>
-              <w:pStyle w:val="Sansinterligne"/>
-              <w:rPr>
-                <w:lang w:val="en-US"/>
-              </w:rPr>
-            </w:pPr>
-            <w:r>
-              <w:rPr>
-                <w:lang w:val="en-US"/>
-              </w:rPr>
-              <w:t>&lt; 65 µm (96 %)</w:t>
-            </w:r>
-          </w:p>
-        </w:tc>
-        <w:tc>
-          <w:tcPr>
-            <w:tcW w:w="932" w:type="dxa"/>
-          </w:tcPr>
-          <w:p>
-            <w:pPr>
-              <w:pStyle w:val="Sansinterligne"/>
-              <w:rPr>
-                <w:lang w:val="en-US"/>
-              </w:rPr>
-            </w:pPr>
-            <w:r>
-              <w:rPr>
-                <w:lang w:val="en-US"/>
-              </w:rPr>
-              <w:t xml:space="preserve">4.9 </w:t>
-            </w:r>
-            <w:r>
-              <w:rPr>
-                <w:lang w:val="en-US"/>
-              </w:rPr>
-              <w:br/>
-              <w:t>[4.2-5.6]</w:t>
-            </w:r>
-          </w:p>
-        </w:tc>
-        <w:tc>
-          <w:tcPr>
-            <w:tcW w:w="4111" w:type="dxa"/>
-          </w:tcPr>
-          <w:p>
-            <w:pPr>
-              <w:pStyle w:val="Sansinterligne"/>
-              <w:rPr>
-                <w:lang w:val="en-US"/>
-              </w:rPr>
-            </w:pPr>
-            <w:r>
-              <w:rPr>
-                <w:lang w:val="en-US"/>
-              </w:rPr>
-              <w:t xml:space="preserve">Gastropod: </w:t>
-            </w:r>
-            <w:proofErr w:type="spellStart"/>
-            <w:r>
-              <w:rPr>
-                <w:lang w:val="en-US"/>
-              </w:rPr>
-              <w:t>Peringia</w:t>
-            </w:r>
-            <w:proofErr w:type="spellEnd"/>
-            <w:r>
-              <w:rPr>
-                <w:lang w:val="en-US"/>
-              </w:rPr>
-              <w:t xml:space="preserve"> </w:t>
-            </w:r>
-            <w:proofErr w:type="spellStart"/>
-            <w:r>
-              <w:rPr>
-                <w:lang w:val="en-US"/>
-              </w:rPr>
-              <w:t>ulvae</w:t>
-            </w:r>
-            <w:proofErr w:type="spellEnd"/>
-            <w:r>
-              <w:rPr>
-                <w:lang w:val="en-US"/>
-              </w:rPr>
-              <w:t xml:space="preserve"> (48 %)</w:t>
-            </w:r>
-            <w:r>
-              <w:rPr>
-                <w:lang w:val="en-US"/>
-              </w:rPr>
-              <w:br/>
-              <w:t xml:space="preserve">Bivalve: </w:t>
-            </w:r>
-            <w:proofErr w:type="spellStart"/>
-            <w:r>
-              <w:rPr>
-                <w:lang w:val="en-US"/>
-              </w:rPr>
-              <w:t>Scrobicularia</w:t>
-            </w:r>
-            <w:proofErr w:type="spellEnd"/>
-            <w:r>
-              <w:rPr>
-                <w:lang w:val="en-US"/>
-              </w:rPr>
-              <w:t xml:space="preserve"> plana</w:t>
-            </w:r>
-            <w:r>
-              <w:rPr>
-                <w:lang w:val="en-US"/>
-              </w:rPr>
-              <w:t xml:space="preserve"> (11 %)</w:t>
-            </w:r>
-            <w:r>
-              <w:rPr>
-                <w:lang w:val="en-US"/>
-              </w:rPr>
-              <w:br/>
-              <w:t xml:space="preserve">Crustacea: </w:t>
-            </w:r>
-            <w:proofErr w:type="spellStart"/>
-            <w:r>
-              <w:rPr>
-                <w:lang w:val="en-US"/>
-              </w:rPr>
-              <w:t>Corophium</w:t>
-            </w:r>
-            <w:proofErr w:type="spellEnd"/>
-            <w:r>
-              <w:rPr>
-                <w:lang w:val="en-US"/>
-              </w:rPr>
-              <w:t xml:space="preserve"> </w:t>
-            </w:r>
-            <w:proofErr w:type="spellStart"/>
-            <w:r>
-              <w:rPr>
-                <w:lang w:val="en-US"/>
-              </w:rPr>
-              <w:t>volutator</w:t>
-            </w:r>
-            <w:proofErr w:type="spellEnd"/>
-            <w:r>
-              <w:rPr>
-                <w:lang w:val="en-US"/>
-              </w:rPr>
-              <w:t xml:space="preserve"> (11 %)</w:t>
-            </w:r>
-          </w:p>
-        </w:tc>
-        <w:tc>
-          <w:tcPr>
-            <w:tcW w:w="1312" w:type="dxa"/>
-          </w:tcPr>
-          <w:p>
-            <w:pPr>
-              <w:pStyle w:val="Sansinterligne"/>
-              <w:rPr>
-                <w:lang w:val="en-US"/>
-              </w:rPr>
-            </w:pPr>
-            <w:proofErr w:type="spellStart"/>
-            <w:r>
-              <w:rPr>
-                <w:lang w:val="en-US"/>
-              </w:rPr>
-              <w:t>MEst</w:t>
-            </w:r>
-            <w:proofErr w:type="spellEnd"/>
-            <w:r>
-              <w:rPr>
-                <w:lang w:val="en-US"/>
-              </w:rPr>
-              <w:t xml:space="preserve"> </w:t>
-            </w:r>
-          </w:p>
-          <w:p>
-            <w:pPr>
-              <w:pStyle w:val="Sansinterligne"/>
-              <w:rPr>
-                <w:lang w:val="en-US"/>
-              </w:rPr>
-            </w:pPr>
-            <w:r>
-              <w:rPr>
-                <w:lang w:val="en-US"/>
-              </w:rPr>
-              <w:t>(code A2.31)</w:t>
-            </w:r>
-          </w:p>
-        </w:tc>
-      </w:tr>
-      <w:tr>
-        <w:tc>
-          <w:tcPr>
-            <w:tcW w:w="778" w:type="dxa"/>
-            <w:vMerge/>
-          </w:tcPr>
-          <w:p>
-            <w:pPr>
-              <w:pStyle w:val="Sansinterligne"/>
-              <w:rPr>
-                <w:lang w:val="en-US"/>
-              </w:rPr>
-            </w:pPr>
-          </w:p>
-        </w:tc>
-        <w:tc>
-          <w:tcPr>
-            <w:tcW w:w="848" w:type="dxa"/>
-          </w:tcPr>
-          <w:p>
-            <w:pPr>
-              <w:pStyle w:val="Sansinterligne"/>
-              <w:rPr>
-                <w:lang w:val="en-US"/>
-              </w:rPr>
-            </w:pPr>
-            <w:r>
-              <w:rPr>
-                <w:lang w:val="en-US"/>
-              </w:rPr>
-              <w:t>Subtidal</w:t>
-            </w:r>
-          </w:p>
-        </w:tc>
-        <w:tc>
-          <w:tcPr>
-            <w:tcW w:w="1548" w:type="dxa"/>
-          </w:tcPr>
-          <w:p>
-            <w:pPr>
-              <w:pStyle w:val="Sansinterligne"/>
-              <w:rPr>
-                <w:lang w:val="en-US"/>
-              </w:rPr>
-            </w:pPr>
-            <w:r>
-              <w:rPr>
-                <w:lang w:val="en-US"/>
-              </w:rPr>
-              <w:t>&lt; 65 µm (84 %)</w:t>
-            </w:r>
-          </w:p>
-        </w:tc>
-        <w:tc>
-          <w:tcPr>
-            <w:tcW w:w="932" w:type="dxa"/>
-          </w:tcPr>
-          <w:p>
-            <w:pPr>
-              <w:pStyle w:val="Sansinterligne"/>
-              <w:rPr>
-                <w:lang w:val="en-US"/>
-              </w:rPr>
-            </w:pPr>
-            <w:r>
-              <w:rPr>
-                <w:lang w:val="en-US"/>
-              </w:rPr>
-              <w:t xml:space="preserve">4.6 </w:t>
-            </w:r>
-            <w:r>
-              <w:rPr>
-                <w:lang w:val="en-US"/>
-              </w:rPr>
-              <w:br/>
-              <w:t>[2.8-5.8]</w:t>
-            </w:r>
-          </w:p>
-        </w:tc>
-        <w:tc>
-          <w:tcPr>
-            <w:tcW w:w="4111" w:type="dxa"/>
-          </w:tcPr>
-          <w:p>
-            <w:pPr>
-              <w:pStyle w:val="Sansinterligne"/>
-              <w:rPr>
-                <w:lang w:val="en-US"/>
-              </w:rPr>
-            </w:pPr>
-            <w:r>
-              <w:rPr>
-                <w:lang w:val="en-US"/>
-              </w:rPr>
-              <w:t xml:space="preserve">Sed. </w:t>
-            </w:r>
-            <w:proofErr w:type="spellStart"/>
-            <w:r>
-              <w:rPr>
-                <w:lang w:val="en-US"/>
-              </w:rPr>
-              <w:t>polychete</w:t>
-            </w:r>
-            <w:proofErr w:type="spellEnd"/>
-            <w:r>
-              <w:rPr>
-                <w:lang w:val="en-US"/>
-              </w:rPr>
-              <w:t xml:space="preserve">: </w:t>
-            </w:r>
-            <w:proofErr w:type="spellStart"/>
-            <w:r>
-              <w:rPr>
-                <w:lang w:val="en-US"/>
-              </w:rPr>
-              <w:t>Heteromastus</w:t>
-            </w:r>
-            <w:proofErr w:type="spellEnd"/>
-            <w:r>
-              <w:rPr>
-                <w:lang w:val="en-US"/>
-              </w:rPr>
-              <w:t xml:space="preserve"> </w:t>
-            </w:r>
-            <w:proofErr w:type="spellStart"/>
-            <w:r>
-              <w:rPr>
-                <w:lang w:val="en-US"/>
-              </w:rPr>
-              <w:t>filiformis</w:t>
-            </w:r>
-            <w:proofErr w:type="spellEnd"/>
-            <w:r>
-              <w:rPr>
-                <w:lang w:val="en-US"/>
-              </w:rPr>
-              <w:t xml:space="preserve"> (42 %)</w:t>
-            </w:r>
-            <w:r>
-              <w:rPr>
-                <w:lang w:val="en-US"/>
-              </w:rPr>
-              <w:br/>
-              <w:t xml:space="preserve">Crustacea: </w:t>
-            </w:r>
-            <w:proofErr w:type="spellStart"/>
-            <w:r>
-              <w:rPr>
-                <w:lang w:val="en-US"/>
-              </w:rPr>
-              <w:t>Mesopodopsis</w:t>
-            </w:r>
-            <w:proofErr w:type="spellEnd"/>
-            <w:r>
-              <w:rPr>
-                <w:lang w:val="en-US"/>
-              </w:rPr>
-              <w:t xml:space="preserve"> </w:t>
-            </w:r>
-            <w:proofErr w:type="spellStart"/>
-            <w:r>
-              <w:rPr>
-                <w:lang w:val="en-US"/>
-              </w:rPr>
-              <w:t>slabberi</w:t>
-            </w:r>
-            <w:proofErr w:type="spellEnd"/>
-            <w:r>
-              <w:rPr>
-                <w:lang w:val="en-US"/>
-              </w:rPr>
-              <w:t xml:space="preserve"> (21 %)</w:t>
-            </w:r>
-          </w:p>
-        </w:tc>
-        <w:tc>
-          <w:tcPr>
-            <w:tcW w:w="1312" w:type="dxa"/>
-          </w:tcPr>
-          <w:p>
-            <w:pPr>
-              <w:pStyle w:val="Sansinterligne"/>
-              <w:rPr>
-                <w:lang w:val="en-US"/>
-              </w:rPr>
-            </w:pPr>
-            <w:proofErr w:type="spellStart"/>
-            <w:r>
-              <w:rPr>
-                <w:lang w:val="en-US"/>
-              </w:rPr>
-              <w:t>SMuVS</w:t>
-            </w:r>
-            <w:proofErr w:type="spellEnd"/>
-            <w:r>
-              <w:rPr>
-                <w:lang w:val="en-US"/>
-              </w:rPr>
-              <w:t xml:space="preserve"> </w:t>
-            </w:r>
-          </w:p>
-          <w:p>
-            <w:pPr>
-              <w:pStyle w:val="Sansinterligne"/>
-              <w:rPr>
-                <w:lang w:val="en-US"/>
-              </w:rPr>
-            </w:pPr>
-            <w:r>
-              <w:rPr>
-                <w:lang w:val="en-US"/>
-              </w:rPr>
-              <w:t>(code A5.32)</w:t>
-            </w:r>
-          </w:p>
-        </w:tc>
-      </w:tr>
-      <w:tr>
-        <w:tc>
-          <w:tcPr>
-            <w:tcW w:w="778" w:type="dxa"/>
-            <w:vMerge w:val="restart"/>
-          </w:tcPr>
-          <w:p>
-            <w:pPr>
-              <w:pStyle w:val="Sansinterligne"/>
-              <w:rPr>
-                <w:lang w:val="en-US"/>
-              </w:rPr>
-            </w:pPr>
-            <w:r>
-              <w:rPr>
-                <w:lang w:val="en-US"/>
-              </w:rPr>
-              <w:t>Loire</w:t>
-            </w:r>
-          </w:p>
-        </w:tc>
-        <w:tc>
-          <w:tcPr>
-            <w:tcW w:w="848" w:type="dxa"/>
-          </w:tcPr>
-          <w:p>
-            <w:pPr>
-              <w:pStyle w:val="Sansinterligne"/>
-              <w:rPr>
-                <w:lang w:val="en-US"/>
-              </w:rPr>
-            </w:pPr>
-            <w:r>
-              <w:rPr>
-                <w:lang w:val="en-US"/>
-              </w:rPr>
-              <w:t>Intertidal</w:t>
-            </w:r>
-          </w:p>
-        </w:tc>
-        <w:tc>
-          <w:tcPr>
-            <w:tcW w:w="1548" w:type="dxa"/>
-          </w:tcPr>
-          <w:p>
-            <w:pPr>
-              <w:pStyle w:val="Sansinterligne"/>
-              <w:rPr>
-                <w:lang w:val="en-US"/>
-              </w:rPr>
-            </w:pPr>
-            <w:r>
-              <w:rPr>
-                <w:lang w:val="en-US"/>
-              </w:rPr>
-              <w:t>&lt; 65 µm (72 %)</w:t>
-            </w:r>
-          </w:p>
-        </w:tc>
-        <w:tc>
-          <w:tcPr>
-            <w:tcW w:w="932" w:type="dxa"/>
-          </w:tcPr>
-          <w:p>
-            <w:pPr>
-              <w:pStyle w:val="Sansinterligne"/>
-              <w:rPr>
-                <w:lang w:val="en-US"/>
-              </w:rPr>
-            </w:pPr>
-            <w:r>
-              <w:rPr>
-                <w:lang w:val="en-US"/>
-              </w:rPr>
-              <w:t xml:space="preserve">4.4 </w:t>
-            </w:r>
-            <w:r>
-              <w:rPr>
-                <w:lang w:val="en-US"/>
-              </w:rPr>
-              <w:br/>
-              <w:t>[2.2-6.0]</w:t>
-            </w:r>
-          </w:p>
-        </w:tc>
-        <w:tc>
-          <w:tcPr>
-            <w:tcW w:w="4111" w:type="dxa"/>
-          </w:tcPr>
-          <w:p>
-            <w:pPr>
-              <w:pStyle w:val="Sansinterligne"/>
-              <w:rPr>
-                <w:lang w:val="en-US"/>
-              </w:rPr>
-            </w:pPr>
-            <w:r>
-              <w:rPr>
-                <w:lang w:val="en-US"/>
-              </w:rPr>
-              <w:t xml:space="preserve">Sed. </w:t>
-            </w:r>
-            <w:proofErr w:type="spellStart"/>
-            <w:r>
-              <w:rPr>
-                <w:lang w:val="en-US"/>
-              </w:rPr>
-              <w:t>polychete</w:t>
-            </w:r>
-            <w:proofErr w:type="spellEnd"/>
-            <w:r>
-              <w:rPr>
-                <w:lang w:val="en-US"/>
-              </w:rPr>
-              <w:t xml:space="preserve">: </w:t>
-            </w:r>
-            <w:proofErr w:type="spellStart"/>
-            <w:r>
-              <w:rPr>
-                <w:lang w:val="en-US"/>
-              </w:rPr>
-              <w:t>Heteromastus</w:t>
-            </w:r>
-            <w:proofErr w:type="spellEnd"/>
-            <w:r>
-              <w:rPr>
-                <w:lang w:val="en-US"/>
-              </w:rPr>
-              <w:t xml:space="preserve"> </w:t>
-            </w:r>
-            <w:proofErr w:type="spellStart"/>
-            <w:r>
-              <w:rPr>
-                <w:lang w:val="en-US"/>
-              </w:rPr>
-              <w:t>filiformis</w:t>
-            </w:r>
-            <w:proofErr w:type="spellEnd"/>
-            <w:r>
-              <w:rPr>
-                <w:lang w:val="en-US"/>
-              </w:rPr>
-              <w:t xml:space="preserve"> (36 %)</w:t>
-            </w:r>
-            <w:r>
-              <w:rPr>
-                <w:lang w:val="en-US"/>
-              </w:rPr>
-              <w:br/>
-            </w:r>
-            <w:r>
-              <w:rPr>
-                <w:lang w:val="en-US"/>
-              </w:rPr>
-              <w:t xml:space="preserve">Bivalve: </w:t>
-            </w:r>
-            <w:proofErr w:type="spellStart"/>
-            <w:r>
-              <w:rPr>
-                <w:lang w:val="en-US"/>
-              </w:rPr>
-              <w:t>Scrobicularia</w:t>
-            </w:r>
-            <w:proofErr w:type="spellEnd"/>
-            <w:r>
-              <w:rPr>
-                <w:lang w:val="en-US"/>
-              </w:rPr>
-              <w:t xml:space="preserve"> plana (16%)</w:t>
-            </w:r>
-          </w:p>
-        </w:tc>
-        <w:tc>
-          <w:tcPr>
-            <w:tcW w:w="1312" w:type="dxa"/>
-          </w:tcPr>
-          <w:p>
-            <w:pPr>
-              <w:pStyle w:val="Sansinterligne"/>
-              <w:rPr>
-                <w:lang w:val="en-US"/>
-              </w:rPr>
-            </w:pPr>
-            <w:proofErr w:type="spellStart"/>
-            <w:r>
-              <w:rPr>
-                <w:lang w:val="en-US"/>
-              </w:rPr>
-              <w:t>MEst</w:t>
-            </w:r>
-            <w:proofErr w:type="spellEnd"/>
-            <w:r>
-              <w:rPr>
-                <w:lang w:val="en-US"/>
-              </w:rPr>
-              <w:t xml:space="preserve"> </w:t>
-            </w:r>
-          </w:p>
-          <w:p>
-            <w:pPr>
-              <w:pStyle w:val="Sansinterligne"/>
-              <w:rPr>
-                <w:lang w:val="en-US"/>
-              </w:rPr>
-            </w:pPr>
-            <w:r>
-              <w:rPr>
-                <w:lang w:val="en-US"/>
-              </w:rPr>
-              <w:t>(code A2.31)</w:t>
-            </w:r>
-          </w:p>
-        </w:tc>
-      </w:tr>
-      <w:tr>
-        <w:tc>
-          <w:tcPr>
-            <w:tcW w:w="778" w:type="dxa"/>
-            <w:vMerge/>
-          </w:tcPr>
-          <w:p>
-            <w:pPr>
-              <w:pStyle w:val="Sansinterligne"/>
-              <w:rPr>
-                <w:lang w:val="en-US"/>
-              </w:rPr>
-            </w:pPr>
-          </w:p>
-        </w:tc>
-        <w:tc>
-          <w:tcPr>
-            <w:tcW w:w="848" w:type="dxa"/>
-          </w:tcPr>
-          <w:p>
-            <w:pPr>
-              <w:pStyle w:val="Sansinterligne"/>
-              <w:rPr>
-                <w:lang w:val="en-US"/>
-              </w:rPr>
-            </w:pPr>
-            <w:r>
-              <w:rPr>
-                <w:lang w:val="en-US"/>
-              </w:rPr>
-              <w:t>Subtidal</w:t>
-            </w:r>
-          </w:p>
-        </w:tc>
-        <w:tc>
-          <w:tcPr>
-            <w:tcW w:w="1548" w:type="dxa"/>
-          </w:tcPr>
-          <w:p>
-            <w:pPr>
-              <w:pStyle w:val="Sansinterligne"/>
-              <w:rPr>
-                <w:lang w:val="en-US"/>
-              </w:rPr>
-            </w:pPr>
-            <w:r>
-              <w:rPr>
-                <w:lang w:val="en-US"/>
-              </w:rPr>
-              <w:t>&lt; 65 µm (42 %)</w:t>
-            </w:r>
-          </w:p>
-        </w:tc>
-        <w:tc>
-          <w:tcPr>
-            <w:tcW w:w="932" w:type="dxa"/>
-          </w:tcPr>
-          <w:p>
-            <w:pPr>
-              <w:pStyle w:val="Sansinterligne"/>
-              <w:rPr>
-                <w:lang w:val="en-US"/>
-              </w:rPr>
-            </w:pPr>
-            <w:r>
-              <w:rPr>
-                <w:lang w:val="en-US"/>
-              </w:rPr>
-              <w:t>2.2</w:t>
-            </w:r>
-            <w:r>
-              <w:rPr>
-                <w:lang w:val="en-US"/>
-              </w:rPr>
-              <w:br/>
-              <w:t>[1.5-4.0]</w:t>
-            </w:r>
-          </w:p>
-        </w:tc>
-        <w:tc>
-          <w:tcPr>
-            <w:tcW w:w="4111" w:type="dxa"/>
-          </w:tcPr>
-          <w:p>
-            <w:pPr>
-              <w:pStyle w:val="Sansinterligne"/>
-              <w:rPr>
-                <w:lang w:val="en-US"/>
-              </w:rPr>
-            </w:pPr>
-            <w:r>
-              <w:rPr>
-                <w:lang w:val="en-US"/>
-              </w:rPr>
-              <w:t xml:space="preserve">Sed. </w:t>
-            </w:r>
-            <w:proofErr w:type="spellStart"/>
-            <w:r>
-              <w:rPr>
-                <w:lang w:val="en-US"/>
-              </w:rPr>
-              <w:t>polychete</w:t>
-            </w:r>
-            <w:proofErr w:type="spellEnd"/>
-            <w:r>
-              <w:rPr>
-                <w:lang w:val="en-US"/>
-              </w:rPr>
-              <w:t>:</w:t>
-            </w:r>
-            <w:r>
-              <w:rPr>
-                <w:lang w:val="en-US"/>
-              </w:rPr>
-              <w:t xml:space="preserve"> </w:t>
-            </w:r>
-            <w:proofErr w:type="spellStart"/>
-            <w:r>
-              <w:rPr>
-                <w:lang w:val="en-US"/>
-              </w:rPr>
-              <w:t>Boccardiella</w:t>
-            </w:r>
-            <w:proofErr w:type="spellEnd"/>
-            <w:r>
-              <w:rPr>
-                <w:lang w:val="en-US"/>
-              </w:rPr>
-              <w:t xml:space="preserve"> </w:t>
-            </w:r>
-            <w:proofErr w:type="spellStart"/>
-            <w:r>
-              <w:rPr>
-                <w:lang w:val="en-US"/>
-              </w:rPr>
-              <w:t>ligerica</w:t>
-            </w:r>
-            <w:proofErr w:type="spellEnd"/>
-            <w:r>
-              <w:rPr>
-                <w:lang w:val="en-US"/>
-              </w:rPr>
-              <w:t xml:space="preserve"> (70 %)</w:t>
-            </w:r>
-          </w:p>
-        </w:tc>
-        <w:tc>
-          <w:tcPr>
-            <w:tcW w:w="1312" w:type="dxa"/>
-          </w:tcPr>
-          <w:p>
-            <w:pPr>
-              <w:pStyle w:val="Sansinterligne"/>
-              <w:rPr>
-                <w:lang w:val="en-US"/>
-              </w:rPr>
-            </w:pPr>
-            <w:proofErr w:type="spellStart"/>
-            <w:r>
-              <w:rPr>
-                <w:lang w:val="en-US"/>
-              </w:rPr>
-              <w:t>IMuSa</w:t>
-            </w:r>
-            <w:proofErr w:type="spellEnd"/>
-            <w:r>
-              <w:rPr>
-                <w:lang w:val="en-US"/>
-              </w:rPr>
-              <w:t xml:space="preserve"> </w:t>
-            </w:r>
-          </w:p>
-          <w:p>
-            <w:pPr>
-              <w:pStyle w:val="Sansinterligne"/>
-              <w:rPr>
-                <w:lang w:val="en-US"/>
-              </w:rPr>
-            </w:pPr>
-            <w:r>
-              <w:rPr>
-                <w:lang w:val="en-US"/>
-              </w:rPr>
-              <w:t>(code A5.25)</w:t>
-            </w:r>
-          </w:p>
-        </w:tc>
-      </w:tr>
-      <w:tr>
-        <w:tc>
-          <w:tcPr>
-            <w:tcW w:w="778" w:type="dxa"/>
-            <w:vMerge w:val="restart"/>
-          </w:tcPr>
-          <w:p>
-            <w:pPr>
-              <w:pStyle w:val="Sansinterligne"/>
-              <w:rPr>
-                <w:lang w:val="en-US"/>
-              </w:rPr>
-            </w:pPr>
-            <w:r>
-              <w:rPr>
-                <w:lang w:val="en-US"/>
-              </w:rPr>
-              <w:t>Seine</w:t>
-            </w:r>
-          </w:p>
-        </w:tc>
-        <w:tc>
-          <w:tcPr>
-            <w:tcW w:w="848" w:type="dxa"/>
-          </w:tcPr>
-          <w:p>
-            <w:pPr>
-              <w:pStyle w:val="Sansinterligne"/>
-              <w:rPr>
-                <w:lang w:val="en-US"/>
-              </w:rPr>
-            </w:pPr>
-            <w:r>
-              <w:rPr>
-                <w:lang w:val="en-US"/>
-              </w:rPr>
-              <w:t>Intertidal</w:t>
-            </w:r>
-          </w:p>
-        </w:tc>
-        <w:tc>
-          <w:tcPr>
-            <w:tcW w:w="1548" w:type="dxa"/>
-          </w:tcPr>
-          <w:p>
-            <w:pPr>
-              <w:pStyle w:val="Sansinterligne"/>
-              <w:rPr>
-                <w:lang w:val="en-US"/>
-              </w:rPr>
-            </w:pPr>
-            <w:r>
-              <w:rPr>
-                <w:lang w:val="en-US"/>
-              </w:rPr>
-              <w:t>160 – 200 µm (26 %)</w:t>
-            </w:r>
-            <w:r>
-              <w:rPr>
-                <w:lang w:val="en-US"/>
-              </w:rPr>
-              <w:br/>
-              <w:t>125 – 160 µm (18 %)</w:t>
-            </w:r>
-          </w:p>
-        </w:tc>
-        <w:tc>
-          <w:tcPr>
-            <w:tcW w:w="932" w:type="dxa"/>
-          </w:tcPr>
-          <w:p>
-            <w:pPr>
-              <w:pStyle w:val="Sansinterligne"/>
-              <w:rPr>
-                <w:lang w:val="en-US"/>
-              </w:rPr>
-            </w:pPr>
-            <w:r>
-              <w:rPr>
-                <w:lang w:val="en-US"/>
-              </w:rPr>
-              <w:t xml:space="preserve">1.3 </w:t>
-            </w:r>
-          </w:p>
-          <w:p>
-            <w:pPr>
-              <w:pStyle w:val="Sansinterligne"/>
-              <w:rPr>
-                <w:lang w:val="en-US"/>
-              </w:rPr>
-            </w:pPr>
-            <w:r>
-              <w:rPr>
-                <w:lang w:val="en-US"/>
-              </w:rPr>
-              <w:t>[0.8-3.7]</w:t>
-            </w:r>
-          </w:p>
-        </w:tc>
-        <w:tc>
-          <w:tcPr>
-            <w:tcW w:w="4111" w:type="dxa"/>
-          </w:tcPr>
-          <w:p>
-            <w:pPr>
-              <w:pStyle w:val="Sansinterligne"/>
-              <w:rPr>
-                <w:lang w:val="en-US"/>
-              </w:rPr>
-            </w:pPr>
-            <w:r>
-              <w:rPr>
-                <w:lang w:val="en-US"/>
-              </w:rPr>
-              <w:t xml:space="preserve">Bivalves: </w:t>
-            </w:r>
-            <w:proofErr w:type="spellStart"/>
-            <w:r>
-              <w:rPr>
-                <w:lang w:val="en-US"/>
-              </w:rPr>
-              <w:t>Cerastoderma</w:t>
-            </w:r>
-            <w:proofErr w:type="spellEnd"/>
-            <w:r>
-              <w:rPr>
-                <w:lang w:val="en-US"/>
-              </w:rPr>
-              <w:t xml:space="preserve"> </w:t>
-            </w:r>
-            <w:proofErr w:type="spellStart"/>
-            <w:r>
-              <w:rPr>
-                <w:lang w:val="en-US"/>
-              </w:rPr>
-              <w:t>edule</w:t>
-            </w:r>
-            <w:proofErr w:type="spellEnd"/>
-            <w:r>
-              <w:rPr>
-                <w:lang w:val="en-US"/>
-              </w:rPr>
-              <w:t xml:space="preserve"> (25 %), </w:t>
-            </w:r>
-            <w:proofErr w:type="spellStart"/>
-            <w:r>
-              <w:rPr>
-                <w:lang w:val="en-US"/>
-              </w:rPr>
-              <w:t>Macoma</w:t>
-            </w:r>
-            <w:proofErr w:type="spellEnd"/>
-            <w:r>
-              <w:rPr>
-                <w:lang w:val="en-US"/>
-              </w:rPr>
-              <w:t xml:space="preserve"> </w:t>
-            </w:r>
-            <w:proofErr w:type="spellStart"/>
-            <w:r>
-              <w:rPr>
-                <w:lang w:val="en-US"/>
-              </w:rPr>
-              <w:t>balthica</w:t>
-            </w:r>
-            <w:proofErr w:type="spellEnd"/>
-            <w:r>
-              <w:rPr>
-                <w:lang w:val="en-US"/>
-              </w:rPr>
-              <w:t xml:space="preserve"> (21 %)</w:t>
-            </w:r>
-          </w:p>
-        </w:tc>
-        <w:tc>
-          <w:tcPr>
-            <w:tcW w:w="1312" w:type="dxa"/>
-          </w:tcPr>
-          <w:p>
-            <w:pPr>
-              <w:pStyle w:val="Sansinterligne"/>
-              <w:rPr>
-                <w:lang w:val="en-US"/>
-              </w:rPr>
-            </w:pPr>
-            <w:proofErr w:type="spellStart"/>
-            <w:r>
-              <w:rPr>
-                <w:lang w:val="en-US"/>
-              </w:rPr>
-              <w:t>MuSa</w:t>
-            </w:r>
-            <w:proofErr w:type="spellEnd"/>
-            <w:r>
-              <w:rPr>
-                <w:lang w:val="en-US"/>
-              </w:rPr>
-              <w:t xml:space="preserve"> </w:t>
-            </w:r>
-          </w:p>
-          <w:p>
-            <w:pPr>
-              <w:pStyle w:val="Sansinterligne"/>
-              <w:rPr>
-                <w:lang w:val="en-US"/>
-              </w:rPr>
-            </w:pPr>
-            <w:r>
-              <w:rPr>
-                <w:lang w:val="en-US"/>
-              </w:rPr>
-              <w:t>(code A2.24):</w:t>
-            </w:r>
-          </w:p>
-        </w:tc>
-      </w:tr>
-      <w:tr>
-        <w:tc>
-          <w:tcPr>
-            <w:tcW w:w="778" w:type="dxa"/>
-            <w:vMerge/>
-          </w:tcPr>
-          <w:p>
-            <w:pPr>
-              <w:pStyle w:val="Sansinterligne"/>
-              <w:rPr>
-                <w:lang w:val="en-US"/>
-              </w:rPr>
-            </w:pPr>
-          </w:p>
-        </w:tc>
-        <w:tc>
-          <w:tcPr>
-            <w:tcW w:w="848" w:type="dxa"/>
-          </w:tcPr>
-          <w:p>
-            <w:pPr>
-              <w:pStyle w:val="Sansinterligne"/>
-              <w:rPr>
-                <w:lang w:val="en-US"/>
-              </w:rPr>
-            </w:pPr>
-            <w:r>
-              <w:rPr>
-                <w:lang w:val="en-US"/>
-              </w:rPr>
-              <w:t>Subtidal</w:t>
-            </w:r>
-          </w:p>
-        </w:tc>
-        <w:tc>
-          <w:tcPr>
-            <w:tcW w:w="1548" w:type="dxa"/>
-          </w:tcPr>
-          <w:p>
-            <w:pPr>
-              <w:pStyle w:val="Sansinterligne"/>
-              <w:rPr>
-                <w:lang w:val="en-US"/>
-              </w:rPr>
-            </w:pPr>
-            <w:r>
-              <w:rPr>
-                <w:lang w:val="en-US"/>
-              </w:rPr>
-              <w:t>200-250 µm (19 %)</w:t>
-            </w:r>
-            <w:r>
-              <w:rPr>
-                <w:lang w:val="en-US"/>
-              </w:rPr>
-              <w:br/>
-              <w:t>250 – 315 µm (21 %)</w:t>
-            </w:r>
-          </w:p>
-        </w:tc>
-        <w:tc>
-          <w:tcPr>
-            <w:tcW w:w="932" w:type="dxa"/>
-          </w:tcPr>
-          <w:p>
-            <w:pPr>
-              <w:pStyle w:val="Sansinterligne"/>
-              <w:rPr>
-                <w:lang w:val="en-US"/>
-              </w:rPr>
-            </w:pPr>
-            <w:r>
-              <w:rPr>
-                <w:lang w:val="en-US"/>
-              </w:rPr>
-              <w:t xml:space="preserve">1.2 </w:t>
-            </w:r>
-          </w:p>
-          <w:p>
-            <w:pPr>
-              <w:pStyle w:val="Sansinterligne"/>
-              <w:rPr>
-                <w:lang w:val="en-US"/>
-              </w:rPr>
-            </w:pPr>
-            <w:r>
-              <w:rPr>
-                <w:lang w:val="en-US"/>
-              </w:rPr>
-              <w:t>[0.7-1.7]</w:t>
-            </w:r>
-          </w:p>
-        </w:tc>
-        <w:tc>
-          <w:tcPr>
-            <w:tcW w:w="4111" w:type="dxa"/>
-          </w:tcPr>
-          <w:p>
-            <w:pPr>
-              <w:pStyle w:val="Sansinterligne"/>
-              <w:rPr>
-                <w:lang w:val="en-US"/>
-              </w:rPr>
-            </w:pPr>
-            <w:r>
-              <w:rPr>
-                <w:lang w:val="en-US"/>
-              </w:rPr>
-              <w:t xml:space="preserve">Crustacea: </w:t>
-            </w:r>
-            <w:proofErr w:type="spellStart"/>
-            <w:r>
-              <w:rPr>
-                <w:lang w:val="en-US"/>
-              </w:rPr>
-              <w:t>Haustorius</w:t>
-            </w:r>
-            <w:proofErr w:type="spellEnd"/>
-            <w:r>
-              <w:rPr>
-                <w:lang w:val="en-US"/>
-              </w:rPr>
-              <w:t xml:space="preserve"> </w:t>
-            </w:r>
-            <w:proofErr w:type="spellStart"/>
-            <w:r>
-              <w:rPr>
-                <w:lang w:val="en-US"/>
-              </w:rPr>
-              <w:t>arenarius</w:t>
-            </w:r>
-            <w:proofErr w:type="spellEnd"/>
-            <w:r>
-              <w:rPr>
-                <w:lang w:val="en-US"/>
-              </w:rPr>
-              <w:t xml:space="preserve"> (18 %), </w:t>
-            </w:r>
-            <w:proofErr w:type="spellStart"/>
-            <w:r>
-              <w:rPr>
-                <w:lang w:val="en-US"/>
-              </w:rPr>
-              <w:t>Bathyporeia</w:t>
-            </w:r>
-            <w:proofErr w:type="spellEnd"/>
-            <w:r>
-              <w:rPr>
-                <w:lang w:val="en-US"/>
-              </w:rPr>
-              <w:t xml:space="preserve"> </w:t>
-            </w:r>
-            <w:proofErr w:type="spellStart"/>
-            <w:r>
-              <w:rPr>
-                <w:lang w:val="en-US"/>
-              </w:rPr>
-              <w:t>pilosa</w:t>
-            </w:r>
-            <w:proofErr w:type="spellEnd"/>
-            <w:r>
-              <w:rPr>
-                <w:lang w:val="en-US"/>
-              </w:rPr>
-              <w:t xml:space="preserve"> (13 %)</w:t>
-            </w:r>
-            <w:r>
-              <w:rPr>
-                <w:lang w:val="en-US"/>
-              </w:rPr>
-              <w:br/>
-              <w:t xml:space="preserve">Err. </w:t>
-            </w:r>
-            <w:proofErr w:type="spellStart"/>
-            <w:r>
-              <w:rPr>
-                <w:lang w:val="en-US"/>
-              </w:rPr>
-              <w:t>polychete</w:t>
-            </w:r>
-            <w:proofErr w:type="spellEnd"/>
-            <w:r>
-              <w:rPr>
-                <w:lang w:val="en-US"/>
-              </w:rPr>
-              <w:t xml:space="preserve">: </w:t>
-            </w:r>
-            <w:proofErr w:type="spellStart"/>
-            <w:r>
-              <w:rPr>
-                <w:lang w:val="en-US"/>
-              </w:rPr>
-              <w:t>Microphthalmus</w:t>
-            </w:r>
-            <w:proofErr w:type="spellEnd"/>
-            <w:r>
-              <w:rPr>
-                <w:lang w:val="en-US"/>
-              </w:rPr>
-              <w:t xml:space="preserve"> (28 %)</w:t>
-            </w:r>
-          </w:p>
-        </w:tc>
-        <w:tc>
-          <w:tcPr>
-            <w:tcW w:w="1312" w:type="dxa"/>
-          </w:tcPr>
-          <w:p>
-            <w:pPr>
-              <w:pStyle w:val="Sansinterligne"/>
-              <w:rPr>
-                <w:lang w:val="en-US"/>
-              </w:rPr>
-            </w:pPr>
-            <w:proofErr w:type="spellStart"/>
-            <w:r>
-              <w:rPr>
-                <w:lang w:val="en-US"/>
-              </w:rPr>
-              <w:t>SSaVS</w:t>
-            </w:r>
-            <w:proofErr w:type="spellEnd"/>
-            <w:r>
-              <w:rPr>
-                <w:lang w:val="en-US"/>
-              </w:rPr>
-              <w:t xml:space="preserve"> </w:t>
-            </w:r>
-          </w:p>
-          <w:p>
-            <w:pPr>
-              <w:pStyle w:val="Sansinterligne"/>
-              <w:rPr>
-                <w:lang w:val="en-US"/>
-              </w:rPr>
-            </w:pPr>
-            <w:r>
-              <w:rPr>
-                <w:lang w:val="en-US"/>
-              </w:rPr>
-              <w:t>(code A5.22)</w:t>
-            </w:r>
-          </w:p>
-        </w:tc>
-      </w:tr>
-    </w:tbl>
-    <w:p>
-      <w:pPr>
-        <w:rPr>
-          <w:lang w:val="en-US"/>
-        </w:rPr>
-      </w:pPr>
-    </w:p>
-    <w:p>
-      <w:pPr>
-        <w:pStyle w:val="Lgende"/>
-        <w:keepNext/>
-        <w:rPr>
-          <w:lang w:val="en-US"/>
-        </w:rPr>
-      </w:pPr>
-      <w:bookmarkStart w:id="6" w:name="_Hlk204160125"/>
-      <w:bookmarkEnd w:id="5"/>
-      <w:r>
-        <w:rPr>
-          <w:lang w:val="en-US"/>
-        </w:rPr>
-        <w:t xml:space="preserve">Table </w:t>
-      </w:r>
-      <w:r>
-        <w:fldChar w:fldCharType="begin"/>
-      </w:r>
-      <w:r>
-        <w:rPr>
-          <w:lang w:val="en-US"/>
-        </w:rPr>
-        <w:instrText xml:space="preserve"> SEQ Table \* ARABIC </w:instrText>
-      </w:r>
-      <w:r>
-        <w:fldChar w:fldCharType="separate"/>
-      </w:r>
-      <w:r>
-        <w:rPr>
-          <w:noProof/>
-          <w:lang w:val="en-US"/>
-        </w:rPr>
-        <w:t>2</w:t>
-      </w:r>
-      <w:r>
-        <w:fldChar w:fldCharType="end"/>
-      </w:r>
-      <w:r>
-        <w:rPr>
-          <w:lang w:val="en-US"/>
-        </w:rPr>
-        <w:t>- Reference conditions of A</w:t>
-      </w:r>
-      <w:r>
-        <w:rPr>
-          <w:lang w:val="en-US"/>
-        </w:rPr>
-        <w:t>MBI, H’ and S</w:t>
-      </w:r>
-    </w:p>
-    <w:tbl>
-      <w:tblPr>
-        <w:tblStyle w:val="Grilledutableau"/>
-        <w:tblW w:w="6804" w:type="dxa"/>
-        <w:tblLook w:val="04A0" w:firstRow="1" w:lastRow="0" w:firstColumn="1" w:lastColumn="0" w:noHBand="0" w:noVBand="1"/>
-      </w:tblPr>
-      <w:tblGrid>
-        <w:gridCol w:w="1271"/>
-        <w:gridCol w:w="2131"/>
-        <w:gridCol w:w="1134"/>
-        <w:gridCol w:w="1134"/>
-        <w:gridCol w:w="1134"/>
-      </w:tblGrid>
-      <w:tr>
-        <w:tc>
-          <w:tcPr>
-            <w:tcW w:w="1271" w:type="dxa"/>
-          </w:tcPr>
-          <w:p>
-            <w:pPr>
-              <w:pStyle w:val="Sansinterligne"/>
-              <w:rPr>
-                <w:lang w:val="en-US"/>
-              </w:rPr>
-            </w:pPr>
-            <w:r>
-              <w:rPr>
-                <w:lang w:val="en-US"/>
-              </w:rPr>
-              <w:t>Level</w:t>
-            </w:r>
-          </w:p>
-        </w:tc>
-        <w:tc>
-          <w:tcPr>
-            <w:tcW w:w="2131" w:type="dxa"/>
-          </w:tcPr>
-          <w:p>
-            <w:pPr>
-              <w:pStyle w:val="Sansinterligne"/>
-              <w:rPr>
-                <w:lang w:val="en-US"/>
-              </w:rPr>
-            </w:pPr>
-            <w:r>
-              <w:rPr>
-                <w:lang w:val="en-US"/>
-              </w:rPr>
-              <w:t>EUNIS habitat</w:t>
-            </w:r>
-          </w:p>
-        </w:tc>
-        <w:tc>
-          <w:tcPr>
-            <w:tcW w:w="1134" w:type="dxa"/>
-          </w:tcPr>
-          <w:p>
-            <w:pPr>
-              <w:pStyle w:val="Sansinterligne"/>
-              <w:rPr>
-                <w:lang w:val="en-US"/>
-              </w:rPr>
-            </w:pPr>
-            <w:proofErr w:type="spellStart"/>
-            <w:r>
-              <w:rPr>
-                <w:lang w:val="en-US"/>
-              </w:rPr>
-              <w:t>AMBIref</w:t>
-            </w:r>
-            <w:proofErr w:type="spellEnd"/>
-          </w:p>
-        </w:tc>
-        <w:tc>
-          <w:tcPr>
-            <w:tcW w:w="1134" w:type="dxa"/>
-          </w:tcPr>
-          <w:p>
-            <w:pPr>
-              <w:pStyle w:val="Sansinterligne"/>
-              <w:rPr>
-                <w:lang w:val="en-US"/>
-              </w:rPr>
-            </w:pPr>
-            <w:proofErr w:type="spellStart"/>
-            <w:r>
-              <w:rPr>
-                <w:lang w:val="en-US"/>
-              </w:rPr>
-              <w:t>H’ref</w:t>
-            </w:r>
-            <w:proofErr w:type="spellEnd"/>
-          </w:p>
-        </w:tc>
-        <w:tc>
-          <w:tcPr>
-            <w:tcW w:w="1134" w:type="dxa"/>
-          </w:tcPr>
-          <w:p>
-            <w:pPr>
-              <w:pStyle w:val="Sansinterligne"/>
-              <w:rPr>
-                <w:lang w:val="en-US"/>
-              </w:rPr>
-            </w:pPr>
-            <w:proofErr w:type="spellStart"/>
-            <w:r>
-              <w:rPr>
-                <w:lang w:val="en-US"/>
-              </w:rPr>
-              <w:t>Sref</w:t>
-            </w:r>
-            <w:proofErr w:type="spellEnd"/>
-          </w:p>
-        </w:tc>
-      </w:tr>
-      <w:tr>
-        <w:tc>
-          <w:tcPr>
-            <w:tcW w:w="1271" w:type="dxa"/>
-            <w:vMerge w:val="restart"/>
-          </w:tcPr>
-          <w:p>
-            <w:pPr>
-              <w:pStyle w:val="Sansinterligne"/>
-              <w:rPr>
-                <w:lang w:val="en-US"/>
-              </w:rPr>
-            </w:pPr>
-            <w:r>
-              <w:rPr>
-                <w:lang w:val="en-US"/>
-              </w:rPr>
-              <w:t>Intertidal</w:t>
-            </w:r>
-          </w:p>
-        </w:tc>
-        <w:tc>
-          <w:tcPr>
-            <w:tcW w:w="2131" w:type="dxa"/>
-          </w:tcPr>
-          <w:p>
-            <w:pPr>
-              <w:pStyle w:val="Sansinterligne"/>
-              <w:rPr>
-                <w:lang w:val="en-US"/>
-              </w:rPr>
-            </w:pPr>
-            <w:proofErr w:type="spellStart"/>
-            <w:r>
-              <w:rPr>
-                <w:lang w:val="en-US"/>
-              </w:rPr>
-              <w:t>MEst</w:t>
-            </w:r>
-            <w:proofErr w:type="spellEnd"/>
-            <w:r>
-              <w:rPr>
-                <w:lang w:val="en-US"/>
-              </w:rPr>
-              <w:t xml:space="preserve"> (code A2.31</w:t>
-            </w:r>
-            <w:r>
-              <w:rPr>
-                <w:lang w:val="en-US"/>
-              </w:rPr>
-              <w:t>)</w:t>
-            </w:r>
-          </w:p>
-        </w:tc>
-        <w:tc>
-          <w:tcPr>
-            <w:tcW w:w="1134" w:type="dxa"/>
-          </w:tcPr>
-          <w:p>
-            <w:pPr>
-              <w:pStyle w:val="Sansinterligne"/>
-              <w:rPr>
-                <w:lang w:val="en-US"/>
-              </w:rPr>
-            </w:pPr>
-            <w:r>
-              <w:rPr>
-                <w:lang w:val="en-US"/>
-              </w:rPr>
-              <w:t>2.5</w:t>
-            </w:r>
-          </w:p>
-        </w:tc>
-        <w:tc>
-          <w:tcPr>
-            <w:tcW w:w="1134" w:type="dxa"/>
-          </w:tcPr>
-          <w:p>
-            <w:pPr>
-              <w:pStyle w:val="Sansinterligne"/>
-              <w:rPr>
-                <w:lang w:val="en-US"/>
-              </w:rPr>
-            </w:pPr>
-            <w:r>
-              <w:rPr>
-                <w:lang w:val="en-US"/>
-              </w:rPr>
-              <w:t>2.9</w:t>
-            </w:r>
-          </w:p>
-        </w:tc>
-        <w:tc>
-          <w:tcPr>
-            <w:tcW w:w="1134" w:type="dxa"/>
-          </w:tcPr>
-          <w:p>
-            <w:pPr>
-              <w:pStyle w:val="Sansinterligne"/>
-              <w:rPr>
-                <w:lang w:val="en-US"/>
-              </w:rPr>
-            </w:pPr>
-            <w:r>
-              <w:rPr>
-                <w:lang w:val="en-US"/>
-              </w:rPr>
-              <w:t>14</w:t>
-            </w:r>
-          </w:p>
-        </w:tc>
-      </w:tr>
-      <w:tr>
-        <w:tc>
-          <w:tcPr>
-            <w:tcW w:w="1271" w:type="dxa"/>
-            <w:vMerge/>
-          </w:tcPr>
-          <w:p>
-            <w:pPr>
-              <w:pStyle w:val="Sansinterligne"/>
-              <w:rPr>
-                <w:lang w:val="en-US"/>
-              </w:rPr>
-            </w:pPr>
-          </w:p>
-        </w:tc>
-        <w:tc>
-          <w:tcPr>
-            <w:tcW w:w="2131" w:type="dxa"/>
-          </w:tcPr>
-          <w:p>
-            <w:pPr>
-              <w:pStyle w:val="Sansinterligne"/>
-            </w:pPr>
-            <w:proofErr w:type="spellStart"/>
-            <w:r>
-              <w:rPr>
-                <w:lang w:val="en-US"/>
-              </w:rPr>
-              <w:t>MuSa</w:t>
-            </w:r>
-            <w:proofErr w:type="spellEnd"/>
-            <w:r>
-              <w:rPr>
-                <w:lang w:val="en-US"/>
-              </w:rPr>
-              <w:t xml:space="preserve"> (code A2.24)</w:t>
-            </w:r>
-          </w:p>
-        </w:tc>
-        <w:tc>
-          <w:tcPr>
-            <w:tcW w:w="1134" w:type="dxa"/>
-          </w:tcPr>
-          <w:p>
-            <w:pPr>
-              <w:pStyle w:val="Sansinterligne"/>
-              <w:rPr>
-                <w:lang w:val="en-US"/>
-              </w:rPr>
-            </w:pPr>
-            <w:r>
-              <w:rPr>
-                <w:lang w:val="en-US"/>
-              </w:rPr>
-              <w:t>1.4</w:t>
-            </w:r>
-          </w:p>
-        </w:tc>
-        <w:tc>
-          <w:tcPr>
-            <w:tcW w:w="1134" w:type="dxa"/>
-          </w:tcPr>
-          <w:p>
-            <w:pPr>
-              <w:pStyle w:val="Sansinterligne"/>
-              <w:rPr>
-                <w:lang w:val="en-US"/>
-              </w:rPr>
-            </w:pPr>
-            <w:r>
-              <w:rPr>
-                <w:lang w:val="en-US"/>
-              </w:rPr>
-              <w:t>3.7</w:t>
-            </w:r>
-          </w:p>
-        </w:tc>
-        <w:tc>
-          <w:tcPr>
-            <w:tcW w:w="1134" w:type="dxa"/>
-          </w:tcPr>
-          <w:p>
-            <w:pPr>
-              <w:pStyle w:val="Sansinterligne"/>
-              <w:rPr>
-                <w:lang w:val="en-US"/>
-              </w:rPr>
-            </w:pPr>
-            <w:r>
-              <w:rPr>
-                <w:lang w:val="en-US"/>
-              </w:rPr>
-              <w:t>26</w:t>
-            </w:r>
-          </w:p>
-        </w:tc>
-      </w:tr>
-      <w:tr>
-        <w:tc>
-          <w:tcPr>
-            <w:tcW w:w="1271" w:type="dxa"/>
-            <w:vMerge w:val="restart"/>
-          </w:tcPr>
-          <w:p>
-            <w:pPr>
-              <w:pStyle w:val="Sansinterligne"/>
-              <w:rPr>
-                <w:lang w:val="en-US"/>
-              </w:rPr>
-            </w:pPr>
-            <w:r>
-              <w:rPr>
-                <w:lang w:val="en-US"/>
-              </w:rPr>
-              <w:t>Subtidal</w:t>
-            </w:r>
-          </w:p>
-        </w:tc>
-        <w:tc>
-          <w:tcPr>
-            <w:tcW w:w="2131" w:type="dxa"/>
-          </w:tcPr>
-          <w:p>
-            <w:pPr>
-              <w:pStyle w:val="Sansinterligne"/>
-              <w:rPr>
-                <w:lang w:val="en-US"/>
-              </w:rPr>
-            </w:pPr>
-            <w:proofErr w:type="spellStart"/>
-            <w:r>
-              <w:rPr>
-                <w:lang w:val="en-US"/>
-              </w:rPr>
-              <w:t>SMuVS</w:t>
-            </w:r>
-            <w:proofErr w:type="spellEnd"/>
-            <w:r>
-              <w:rPr>
-                <w:lang w:val="en-US"/>
-              </w:rPr>
-              <w:t xml:space="preserve"> (code A5.32)</w:t>
-            </w:r>
-          </w:p>
-        </w:tc>
-        <w:tc>
-          <w:tcPr>
-            <w:tcW w:w="1134" w:type="dxa"/>
-          </w:tcPr>
-          <w:p>
-            <w:pPr>
-              <w:pStyle w:val="Sansinterligne"/>
-              <w:rPr>
-                <w:lang w:val="en-US"/>
-              </w:rPr>
-            </w:pPr>
-            <w:r>
-              <w:rPr>
-                <w:lang w:val="en-US"/>
-              </w:rPr>
-              <w:t>1.9</w:t>
-            </w:r>
-          </w:p>
-        </w:tc>
-        <w:tc>
-          <w:tcPr>
-            <w:tcW w:w="1134" w:type="dxa"/>
-          </w:tcPr>
-          <w:p>
-            <w:pPr>
-              <w:pStyle w:val="Sansinterligne"/>
-              <w:rPr>
-                <w:lang w:val="en-US"/>
-              </w:rPr>
-            </w:pPr>
-            <w:r>
-              <w:rPr>
-                <w:lang w:val="en-US"/>
-              </w:rPr>
-              <w:t>2.5</w:t>
-            </w:r>
-          </w:p>
-        </w:tc>
-        <w:tc>
-          <w:tcPr>
-            <w:tcW w:w="1134" w:type="dxa"/>
-          </w:tcPr>
-          <w:p>
-            <w:pPr>
-              <w:pStyle w:val="Sansinterligne"/>
-              <w:rPr>
-                <w:lang w:val="en-US"/>
-              </w:rPr>
-            </w:pPr>
-            <w:r>
-              <w:rPr>
-                <w:lang w:val="en-US"/>
-              </w:rPr>
-              <w:t>10</w:t>
-            </w:r>
-          </w:p>
-        </w:tc>
-      </w:tr>
-      <w:tr>
-        <w:tc>
-          <w:tcPr>
-            <w:tcW w:w="1271" w:type="dxa"/>
-            <w:vMerge/>
-          </w:tcPr>
-          <w:p>
-            <w:pPr>
-              <w:pStyle w:val="Sansinterligne"/>
-              <w:rPr>
-                <w:lang w:val="en-US"/>
-              </w:rPr>
-            </w:pPr>
-          </w:p>
-        </w:tc>
-        <w:tc>
-          <w:tcPr>
-            <w:tcW w:w="2131" w:type="dxa"/>
-          </w:tcPr>
-          <w:p>
-            <w:pPr>
-              <w:pStyle w:val="Sansinterligne"/>
-              <w:rPr>
-                <w:lang w:val="en-US"/>
-              </w:rPr>
-            </w:pPr>
-            <w:proofErr w:type="spellStart"/>
-            <w:r>
-              <w:rPr>
-                <w:lang w:val="en-US"/>
-              </w:rPr>
-              <w:t>IMuSa</w:t>
-            </w:r>
-            <w:proofErr w:type="spellEnd"/>
-            <w:r>
-              <w:rPr>
-                <w:lang w:val="en-US"/>
-              </w:rPr>
-              <w:t xml:space="preserve"> (code A5.25)</w:t>
-            </w:r>
-          </w:p>
-        </w:tc>
-        <w:tc>
-          <w:tcPr>
-            <w:tcW w:w="1134" w:type="dxa"/>
-          </w:tcPr>
-          <w:p>
-            <w:pPr>
-              <w:pStyle w:val="Sansinterligne"/>
-              <w:rPr>
-                <w:lang w:val="en-US"/>
-              </w:rPr>
-            </w:pPr>
-            <w:r>
-              <w:rPr>
-                <w:lang w:val="en-US"/>
-              </w:rPr>
-              <w:t>1.0</w:t>
-            </w:r>
-          </w:p>
-        </w:tc>
-        <w:tc>
-          <w:tcPr>
-            <w:tcW w:w="1134" w:type="dxa"/>
-          </w:tcPr>
-          <w:p>
-            <w:pPr>
-              <w:pStyle w:val="Sansinterligne"/>
-              <w:rPr>
-                <w:lang w:val="en-US"/>
-              </w:rPr>
-            </w:pPr>
-            <w:r>
-              <w:rPr>
-                <w:lang w:val="en-US"/>
-              </w:rPr>
-              <w:t>3.8</w:t>
-            </w:r>
-          </w:p>
-        </w:tc>
-        <w:tc>
-          <w:tcPr>
-            <w:tcW w:w="1134" w:type="dxa"/>
-          </w:tcPr>
-          <w:p>
-            <w:pPr>
-              <w:pStyle w:val="Sansinterligne"/>
-              <w:rPr>
-                <w:lang w:val="en-US"/>
-              </w:rPr>
-            </w:pPr>
-            <w:r>
-              <w:rPr>
-                <w:lang w:val="en-US"/>
-              </w:rPr>
-              <w:t>33</w:t>
-            </w:r>
-          </w:p>
-        </w:tc>
-      </w:tr>
-      <w:tr>
-        <w:tc>
-          <w:tcPr>
-            <w:tcW w:w="1271" w:type="dxa"/>
-            <w:vMerge/>
-          </w:tcPr>
-          <w:p>
-            <w:pPr>
-              <w:pStyle w:val="Sansinterligne"/>
-              <w:rPr>
-                <w:lang w:val="en-US"/>
-              </w:rPr>
-            </w:pPr>
-          </w:p>
-        </w:tc>
-        <w:tc>
-          <w:tcPr>
-            <w:tcW w:w="2131" w:type="dxa"/>
-          </w:tcPr>
-          <w:p>
-            <w:pPr>
-              <w:pStyle w:val="Sansinterligne"/>
-              <w:rPr>
-                <w:lang w:val="en-US"/>
-              </w:rPr>
-            </w:pPr>
-            <w:proofErr w:type="spellStart"/>
-            <w:r>
-              <w:rPr>
-                <w:lang w:val="en-US"/>
-              </w:rPr>
-              <w:t>SSaVS</w:t>
-            </w:r>
-            <w:proofErr w:type="spellEnd"/>
-            <w:r>
-              <w:rPr>
-                <w:lang w:val="en-US"/>
-              </w:rPr>
-              <w:t xml:space="preserve"> (code A5.22)</w:t>
-            </w:r>
-          </w:p>
-        </w:tc>
-        <w:tc>
-          <w:tcPr>
-            <w:tcW w:w="1134" w:type="dxa"/>
-          </w:tcPr>
-          <w:p>
-            <w:pPr>
-              <w:pStyle w:val="Sansinterligne"/>
-              <w:rPr>
-                <w:lang w:val="en-US"/>
-              </w:rPr>
-            </w:pPr>
-            <w:r>
-              <w:rPr>
-                <w:lang w:val="en-US"/>
-              </w:rPr>
-              <w:t>0.3</w:t>
-            </w:r>
-          </w:p>
-        </w:tc>
-        <w:tc>
-          <w:tcPr>
-            <w:tcW w:w="1134" w:type="dxa"/>
-          </w:tcPr>
-          <w:p>
-            <w:pPr>
-              <w:pStyle w:val="Sansinterligne"/>
-              <w:rPr>
-                <w:lang w:val="en-US"/>
-              </w:rPr>
-            </w:pPr>
-            <w:r>
-              <w:rPr>
-                <w:lang w:val="en-US"/>
-              </w:rPr>
-              <w:t>2.7</w:t>
-            </w:r>
-          </w:p>
-        </w:tc>
-        <w:tc>
-          <w:tcPr>
-            <w:tcW w:w="1134" w:type="dxa"/>
-          </w:tcPr>
-          <w:p>
-            <w:pPr>
-              <w:pStyle w:val="Sansinterligne"/>
-              <w:rPr>
-                <w:lang w:val="en-US"/>
-              </w:rPr>
-            </w:pPr>
-            <w:r>
-              <w:rPr>
-                <w:lang w:val="en-US"/>
-              </w:rPr>
-              <w:t>9</w:t>
-            </w:r>
-          </w:p>
-        </w:tc>
-      </w:tr>
-    </w:tbl>
-    <w:p>
-      <w:pPr>
-        <w:rPr>
-          <w:lang w:val="en-US"/>
-        </w:rPr>
-      </w:pPr>
-    </w:p>
-    <w:p>
-      <w:pPr>
-        <w:rPr>
-          <w:lang w:val="en-US"/>
-        </w:rPr>
-      </w:pPr>
-      <w:r>
-        <w:rPr>
-          <w:lang w:val="en-US"/>
-        </w:rPr>
-        <w:t xml:space="preserve">The </w:t>
-      </w:r>
-      <w:r>
-        <w:rPr>
-          <w:lang w:val="en-US"/>
-        </w:rPr>
-        <w:t xml:space="preserve">scoring of BEQI-FR depends on the type of estuary. The </w:t>
-      </w:r>
-      <w:r>
-        <w:rPr>
-          <w:lang w:val="en-US"/>
-        </w:rPr>
-        <w:t xml:space="preserve">Loire, Gironde and Seine estuaries are </w:t>
-      </w:r>
-      <w:r>
-        <w:rPr>
-          <w:lang w:val="en-US"/>
-        </w:rPr>
-        <w:t xml:space="preserve">typified as large estuaries (type D) and the scoring grid is presented in </w:t>
-      </w:r>
-      <w:r>
-        <w:rPr>
-          <w:lang w:val="en-US"/>
-        </w:rPr>
-        <w:fldChar w:fldCharType="begin"/>
-      </w:r>
-      <w:r>
-        <w:rPr>
-          <w:lang w:val="en-US"/>
-        </w:rPr>
-        <w:instrText xml:space="preserve"> REF _Ref203047237 \h </w:instrText>
-      </w:r>
-      <w:r>
-        <w:rPr>
-          <w:lang w:val="en-US"/>
-        </w:rPr>
-      </w:r>
-      <w:r>
-        <w:rPr>
-          <w:lang w:val="en-US"/>
-        </w:rPr>
-        <w:fldChar w:fldCharType="separate"/>
-      </w:r>
-      <w:r>
-        <w:rPr>
-          <w:lang w:val="en-US"/>
-        </w:rPr>
-        <w:t xml:space="preserve">Table </w:t>
-      </w:r>
-      <w:r>
-        <w:rPr>
-          <w:noProof/>
-          <w:lang w:val="en-US"/>
-        </w:rPr>
-        <w:t>3</w:t>
-      </w:r>
-      <w:r>
-        <w:rPr>
-          <w:lang w:val="en-US"/>
-        </w:rPr>
-        <w:fldChar w:fldCharType="end"/>
-      </w:r>
-      <w:r>
-        <w:rPr>
-          <w:lang w:val="en-US"/>
-        </w:rPr>
-        <w:t xml:space="preserve">. All values above 1 must be fixed to 1 </w:t>
-      </w:r>
-      <w:r>
-        <w:rPr>
-          <w:lang w:val="en-US"/>
-        </w:rPr>
-        <w:fldChar w:fldCharType="begin"/>
-      </w:r>
-      <w:r>
-        <w:rPr>
-          <w:lang w:val="en-US"/>
-        </w:rPr>
-        <w:instrText xml:space="preserve"> ADDIN ZOTERO_ITEM CSL_CITATION {"citationID":"4FHldGs1","properties":{"formattedCitation":"(Blanchet {\\i{}et al.}, 2025)","plainCitation":"(Blanchet et al., 2025)","noteIndex":0},"citationItems":[{"id":1204,"uris":["http://zotero.org/users/3305729/items/Q875VASZ"],"itemData":{"id":1204,"type":"report","collection-title":"Rapport Université de Bordeaux/UMR EPOC &amp; Ifremer.","language":"fr","source":"Zotero","title":"Méthodologie pour la surveillance et l’évaluation du paramètre « Macro-invertébrés benthiques » dans les masses d’eau de transition estuariennes de la façade Manche- Atlantique –","URL":"https://archimer.ifremer.fr/doc/00887/99923/118418.pdf","author":[{"family":"Blanchet","given":"Hugues"},{"family":"Fouet","given":"Marie"},{"family":"Bizzozero","given":"Lucie"},{"family":"Foveau","given":"Aurélie"}],"accessed":{"date-parts":[["2025",7,9]]},"issued":{"date-parts":[["2025",3]]},"citation-key":"blanchetMethodologiePourSurveillance2025"}}],"schema":"https://github.com/citation-style-language/schema/raw/master/csl-citation.json"} </w:instrText>
-      </w:r>
-      <w:r>
-        <w:rPr>
-          <w:lang w:val="en-US"/>
-        </w:rPr>
-        <w:fldChar w:fldCharType="separate"/>
-      </w:r>
-      <w:r>
-        <w:rPr>
-          <w:rFonts w:ascii="Calibri Light" w:hAnsi="Calibri Light" w:cs="Calibri Light"/>
-          <w:szCs w:val="24"/>
-          <w:lang w:val="en-US"/>
-        </w:rPr>
-        <w:t xml:space="preserve">(Blanchet </w:t>
-      </w:r>
-      <w:r>
-        <w:rPr>
-          <w:rFonts w:ascii="Calibri Light" w:hAnsi="Calibri Light" w:cs="Calibri Light"/>
-          <w:i/>
-          <w:iCs/>
-          <w:szCs w:val="24"/>
-          <w:lang w:val="en-US"/>
-        </w:rPr>
-        <w:t>et al.</w:t>
-      </w:r>
-      <w:r>
-        <w:rPr>
-          <w:rFonts w:ascii="Calibri Light" w:hAnsi="Calibri Light" w:cs="Calibri Light"/>
-          <w:szCs w:val="24"/>
-          <w:lang w:val="en-US"/>
-        </w:rPr>
-        <w:t>, 2025)</w:t>
-      </w:r>
-      <w:r>
-        <w:rPr>
-          <w:lang w:val="en-US"/>
-        </w:rPr>
-        <w:fldChar w:fldCharType="end"/>
-      </w:r>
-      <w:r>
-        <w:rPr>
-          <w:lang w:val="en-US"/>
-        </w:rPr>
-        <w:t>.</w:t>
-      </w:r>
-    </w:p>
-    <w:p>
-      <w:pPr>
-        <w:pStyle w:val="Lgende"/>
-        <w:keepNext/>
-        <w:rPr>
-          <w:lang w:val="en-US"/>
-        </w:rPr>
-      </w:pPr>
-      <w:bookmarkStart w:id="7" w:name="_Ref203047237"/>
-      <w:r>
-        <w:rPr>
-          <w:lang w:val="en-US"/>
-        </w:rPr>
-        <w:t xml:space="preserve">Table </w:t>
-      </w:r>
-      <w:r>
-        <w:fldChar w:fldCharType="begin"/>
-      </w:r>
-      <w:r>
-        <w:rPr>
-          <w:lang w:val="en-US"/>
-        </w:rPr>
-        <w:instrText xml:space="preserve"> SEQ Table \* ARABIC </w:instrText>
-      </w:r>
-      <w:r>
-        <w:fldChar w:fldCharType="separate"/>
-      </w:r>
-      <w:r>
-        <w:rPr>
-          <w:noProof/>
-          <w:lang w:val="en-US"/>
-        </w:rPr>
-        <w:t>3</w:t>
-      </w:r>
-      <w:r>
-        <w:fldChar w:fldCharType="end"/>
-      </w:r>
-      <w:bookmarkEnd w:id="7"/>
-      <w:r>
-        <w:rPr>
-          <w:lang w:val="en-US"/>
-        </w:rPr>
-        <w:t xml:space="preserve"> - BEQI-FR EQR thresholds</w:t>
-      </w:r>
-      <w:r>
-        <w:rPr>
-          <w:lang w:val="en-US"/>
-        </w:rPr>
-        <w:t xml:space="preserve"> for large estuaries (type D).</w:t>
-      </w:r>
-    </w:p>
-    <w:tbl>
-      <w:tblPr>
-        <w:tblStyle w:val="Grilledutableau"/>
-        <w:tblW w:w="0" w:type="auto"/>
-        <w:tblLook w:val="04A0" w:firstRow="1" w:lastRow="0" w:firstColumn="1" w:lastColumn="0" w:noHBand="0" w:noVBand="1"/>
-      </w:tblPr>
-      <w:tblGrid>
-        <w:gridCol w:w="1742"/>
-        <w:gridCol w:w="1742"/>
-        <w:gridCol w:w="1743"/>
-        <w:gridCol w:w="1743"/>
-        <w:gridCol w:w="1743"/>
-        <w:gridCol w:w="1743"/>
-      </w:tblGrid>
-      <w:tr>
-        <w:tc>
-          <w:tcPr>
-            <w:tcW w:w="1742" w:type="dxa"/>
-          </w:tcPr>
-          <w:p>
-            <w:pPr>
-              <w:pStyle w:val="Sansinterligne"/>
-              <w:rPr>
-                <w:lang w:val="en-US"/>
-              </w:rPr>
-            </w:pPr>
-            <w:r>
-              <w:rPr>
-                <w:lang w:val="en-US"/>
-              </w:rPr>
-              <w:t>BEQI-FR</w:t>
-            </w:r>
-          </w:p>
-        </w:tc>
-        <w:tc>
-          <w:tcPr>
-            <w:tcW w:w="1742" w:type="dxa"/>
-          </w:tcPr>
-          <w:p>
-            <w:pPr>
-              <w:pStyle w:val="Sansinterligne"/>
-              <w:rPr>
-                <w:lang w:val="en-US"/>
-              </w:rPr>
-            </w:pPr>
-            <w:r>
-              <w:rPr>
-                <w:lang w:val="en-US"/>
-              </w:rPr>
-              <w:t>High</w:t>
-            </w:r>
-          </w:p>
-        </w:tc>
-        <w:tc>
-          <w:tcPr>
-            <w:tcW w:w="1743" w:type="dxa"/>
-          </w:tcPr>
-          <w:p>
-            <w:pPr>
-              <w:pStyle w:val="Sansinterligne"/>
-              <w:rPr>
-                <w:lang w:val="en-US"/>
-              </w:rPr>
-            </w:pPr>
-            <w:r>
-              <w:rPr>
-                <w:lang w:val="en-US"/>
-              </w:rPr>
-              <w:t>Good</w:t>
-            </w:r>
-          </w:p>
-        </w:tc>
-        <w:tc>
-          <w:tcPr>
-            <w:tcW w:w="1743" w:type="dxa"/>
-          </w:tcPr>
-          <w:p>
-            <w:pPr>
-              <w:pStyle w:val="Sansinterligne"/>
-              <w:rPr>
-                <w:lang w:val="en-US"/>
-              </w:rPr>
-            </w:pPr>
-            <w:r>
-              <w:rPr>
-                <w:lang w:val="en-US"/>
-              </w:rPr>
-              <w:t>Moderate</w:t>
-            </w:r>
-          </w:p>
-        </w:tc>
-        <w:tc>
-          <w:tcPr>
-            <w:tcW w:w="1743" w:type="dxa"/>
-          </w:tcPr>
-          <w:p>
-            <w:pPr>
-              <w:pStyle w:val="Sansinterligne"/>
-              <w:rPr>
-                <w:lang w:val="en-US"/>
-              </w:rPr>
-            </w:pPr>
-            <w:r>
-              <w:rPr>
-                <w:lang w:val="en-US"/>
-              </w:rPr>
-              <w:t>Poor</w:t>
-            </w:r>
-          </w:p>
-        </w:tc>
-        <w:tc>
-          <w:tcPr>
-            <w:tcW w:w="1743" w:type="dxa"/>
-          </w:tcPr>
-          <w:p>
-            <w:pPr>
-              <w:pStyle w:val="Sansinterligne"/>
-              <w:rPr>
-                <w:lang w:val="en-US"/>
-              </w:rPr>
-            </w:pPr>
-            <w:r>
-              <w:rPr>
-                <w:lang w:val="en-US"/>
-              </w:rPr>
-              <w:t>Bad</w:t>
-            </w:r>
-          </w:p>
-        </w:tc>
-      </w:tr>
-      <w:tr>
-        <w:tc>
-          <w:tcPr>
-            <w:tcW w:w="1742" w:type="dxa"/>
-          </w:tcPr>
-          <w:p>
-            <w:pPr>
-              <w:pStyle w:val="Sansinterligne"/>
-              <w:rPr>
-                <w:lang w:val="en-US"/>
-              </w:rPr>
-            </w:pPr>
-            <w:r>
-              <w:rPr>
-                <w:lang w:val="en-US"/>
-              </w:rPr>
-              <w:t>EQR boundaries</w:t>
-            </w:r>
-          </w:p>
-        </w:tc>
-        <w:tc>
-          <w:tcPr>
-            <w:tcW w:w="1742" w:type="dxa"/>
-          </w:tcPr>
-          <w:p>
-            <w:pPr>
-              <w:pStyle w:val="Sansinterligne"/>
-              <w:rPr>
-                <w:lang w:val="en-US"/>
-              </w:rPr>
-            </w:pPr>
-            <w:r>
-              <w:rPr>
-                <w:lang w:val="en-US"/>
-              </w:rPr>
-              <w:t>]1-0,86]</w:t>
-            </w:r>
-          </w:p>
-        </w:tc>
-        <w:tc>
-          <w:tcPr>
-            <w:tcW w:w="1743" w:type="dxa"/>
-          </w:tcPr>
-          <w:p>
-            <w:pPr>
-              <w:pStyle w:val="Sansinterligne"/>
-              <w:rPr>
-                <w:lang w:val="en-US"/>
-              </w:rPr>
-            </w:pPr>
-            <w:r>
-              <w:rPr>
-                <w:lang w:val="en-US"/>
-              </w:rPr>
-              <w:t>]0,86-0,67]</w:t>
-            </w:r>
-          </w:p>
-        </w:tc>
-        <w:tc>
-          <w:tcPr>
-            <w:tcW w:w="1743" w:type="dxa"/>
-          </w:tcPr>
-          <w:p>
-            <w:pPr>
-              <w:pStyle w:val="Sansinterligne"/>
-              <w:rPr>
-                <w:lang w:val="en-US"/>
-              </w:rPr>
-            </w:pPr>
-            <w:r>
-              <w:rPr>
-                <w:lang w:val="en-US"/>
-              </w:rPr>
-              <w:t>]0,67-0,40]</w:t>
-            </w:r>
-          </w:p>
-        </w:tc>
-        <w:tc>
-          <w:tcPr>
-            <w:tcW w:w="1743" w:type="dxa"/>
-          </w:tcPr>
-          <w:p>
-            <w:pPr>
-              <w:pStyle w:val="Sansinterligne"/>
-              <w:rPr>
-                <w:lang w:val="en-US"/>
-              </w:rPr>
-            </w:pPr>
-            <w:r>
-              <w:rPr>
-                <w:lang w:val="en-US"/>
-              </w:rPr>
-              <w:t>]0,40-0,20]</w:t>
-            </w:r>
-          </w:p>
-        </w:tc>
-        <w:tc>
-          <w:tcPr>
-            <w:tcW w:w="1743" w:type="dxa"/>
-          </w:tcPr>
-          <w:p>
-            <w:pPr>
-              <w:pStyle w:val="Sansinterligne"/>
-              <w:rPr>
-                <w:lang w:val="en-US"/>
-              </w:rPr>
-            </w:pPr>
-            <w:r>
-              <w:rPr>
-                <w:lang w:val="en-US"/>
-              </w:rPr>
-              <w:t>]0,20-0]</w:t>
-            </w:r>
-          </w:p>
-        </w:tc>
-      </w:tr>
-    </w:tbl>
-    <w:p>
-      <w:pPr>
-        <w:rPr>
-          <w:lang w:val="en-US"/>
-        </w:rPr>
-      </w:pPr>
-    </w:p>
-    <w:bookmarkEnd w:id="6"/>
-    <w:p>
-      <w:pPr>
-        <w:rPr>
-          <w:lang w:val="en-US"/>
-        </w:rPr>
-      </w:pPr>
-      <w:r>
-        <w:rPr>
-          <w:lang w:val="en-US"/>
-        </w:rPr>
-        <w:br w:type="page"/>
-      </w:r>
-    </w:p>
-    <w:p>
-      <w:pPr>
-        <w:pStyle w:val="Titre3"/>
-        <w:rPr>
           <w:highlight w:val="yellow"/>
           <w:lang w:val="en-US"/>
         </w:rPr>
-      </w:pPr>
-      <w:proofErr w:type="spellStart"/>
-      <w:r>
-        <w:rPr>
-          <w:highlight w:val="yellow"/>
-          <w:lang w:val="en-US"/>
-        </w:rPr>
-        <w:lastRenderedPageBreak/>
         <w:t>Physico</w:t>
       </w:r>
       <w:proofErr w:type="spellEnd"/>
@@ -14714,7 +10079,6 @@
     </w:p>
     <w:p>
       <w:r>
-        <w:lastRenderedPageBreak/>
         <w:t>{</w:t>
       </w:r>
       <w:proofErr w:type="spellStart"/>
@@ -15018,6 +10382,7 @@
                 <w:noProof/>
                 <w:lang w:val="en-US"/>
               </w:rPr>
+              <w:lastRenderedPageBreak/>
               <w:drawing>
                 <wp:inline distT="0" distB="0" distL="0" distR="0" wp14:anchorId="00D55F42" wp14:editId="458DBC98">
                   <wp:extent cx="4557447" cy="2826327"/>
@@ -15575,65 +10940,6 @@
           <w:lang w:val="en-US"/>
         </w:rPr>
       </w:pPr>
-      <w:r>
-        <w:rPr>
-          <w:lang w:val="en-US"/>
-        </w:rPr>
-        <w:br w:type="page"/>
-      </w:r>
-    </w:p>
-    <w:p>
-      <w:pPr>
-        <w:pStyle w:val="Titre3"/>
-        <w:rPr>
-          <w:highlight w:val="yellow"/>
-          <w:lang w:val="en-US"/>
-        </w:rPr>
-      </w:pPr>
-      <w:r>
-        <w:rPr>
-          <w:highlight w:val="yellow"/>
-          <w:lang w:val="en-US"/>
-        </w:rPr>
-        <w:lastRenderedPageBreak/>
-        <w:t xml:space="preserve">Fish and </w:t>
-      </w:r>
-      <w:proofErr w:type="spellStart"/>
-      <w:r>
-        <w:rPr>
-          <w:highlight w:val="yellow"/>
-          <w:lang w:val="en-US"/>
-        </w:rPr>
-        <w:t>demerso</w:t>
-      </w:r>
-      <w:proofErr w:type="spellEnd"/>
-      <w:r>
-        <w:rPr>
-          <w:highlight w:val="yellow"/>
-          <w:lang w:val="en-US"/>
-        </w:rPr>
-        <w:t>-pelagic preys</w:t>
-      </w:r>
-    </w:p>
-    <w:p>
-      <w:pPr>
-        <w:rPr>
-          <w:lang w:val="en-US"/>
-        </w:rPr>
-      </w:pPr>
-      <w:r>
-        <w:rPr>
-          <w:lang w:val="en-US"/>
-        </w:rPr>
-        <w:br w:type="page"/>
-      </w:r>
-    </w:p>
-    <w:p>
-      <w:pPr>
-        <w:rPr>
-          <w:lang w:val="en-US"/>
-        </w:rPr>
-      </w:pPr>
     </w:p>
     <w:p>
       <w:pPr>
@@ -16078,7 +11384,7 @@
               </w:rPr>
               <w:t> and the excretion of nitrogenous waste by animals [</w:t>
             </w:r>
-            <w:bookmarkStart w:id="8" w:name="bbib5"/>
+            <w:bookmarkStart w:id="2" w:name="bbib5"/>
             <w:r>
               <w:fldChar w:fldCharType="begin"/>
             </w:r>
@@ -16111,7 +11417,7 @@
               </w:rPr>
               <w:t>,</w:t>
             </w:r>
-            <w:bookmarkStart w:id="9" w:name="bbib6"/>
+            <w:bookmarkStart w:id="3" w:name="bbib6"/>
             <w:r>
               <w:fldChar w:fldCharType="begin"/>
             </w:r>
@@ -16191,7 +11497,7 @@
               <w:lastRenderedPageBreak/>
               <w:t>material, which can result in oxygen depletion within the water and contribute to eutrophication, posing a significant threat to the aquatic environment and ecological security [</w:t>
             </w:r>
-            <w:bookmarkStart w:id="10" w:name="bbib7"/>
+            <w:bookmarkStart w:id="4" w:name="bbib7"/>
             <w:r>
               <w:fldChar w:fldCharType="begin"/>
             </w:r>
@@ -16216,7 +11522,7 @@
             <w:r>
               <w:fldChar w:fldCharType="end"/>
             </w:r>
-            <w:bookmarkEnd w:id="10"/>
+            <w:bookmarkEnd w:id="4"/>
             <w:r>
               <w:rPr>
                 <w:rFonts w:ascii="Georgia" w:hAnsi="Georgia"/>
@@ -16255,7 +11561,7 @@
                 <w:t>5</w:t>
               </w:r>
             </w:hyperlink>
-            <w:bookmarkEnd w:id="8"/>
+            <w:bookmarkEnd w:id="2"/>
             <w:r>
               <w:rPr>
                 <w:rFonts w:ascii="Georgia" w:hAnsi="Georgia"/>
@@ -16275,7 +11581,7 @@
                 <w:t>6</w:t>
               </w:r>
             </w:hyperlink>
-            <w:bookmarkEnd w:id="9"/>
+            <w:bookmarkEnd w:id="3"/>
             <w:r>
               <w:rPr>
                 <w:rFonts w:ascii="Georgia" w:hAnsi="Georgia"/>
@@ -19830,7 +15136,7 @@
           <w:lang w:val="en-US"/>
         </w:rPr>
       </w:pPr>
-      <w:bookmarkStart w:id="11" w:name="_Hlk204159459"/>
+      <w:bookmarkStart w:id="5" w:name="_Hlk204159459"/>
       <w:r>
         <w:rPr>
           <w:lang w:val="en-US"/>
@@ -25878,7 +21184,7 @@
         <w:br w:type="page"/>
       </w:r>
     </w:p>
-    <w:bookmarkEnd w:id="11"/>
+    <w:bookmarkEnd w:id="5"/>
     <w:p>
       <w:pPr>
         <w:pStyle w:val="Titre2"/>

</xml_diff>